<commit_message>
docs(mem-ctrl): fix diagram house-style violations (flipped scheduler trapezium, rank spaghetti)
- STYLE.md rule 9: name the graphviz shape (invtrapezium; trapezium is
  narrow-edge-up = upside-down mux); rule 6 + rendering notes against
  same-rank long edges and uncontrollable parallel-edge channels
- common_has 01_whole_unit: rewrite dot to mirror the reference rank
  geography; wide-edge-up flat trapezium; edge-free config block;
  combined WR / RMW label; clean return path up the right side
- common_mas 03: invtrapezium; 08: five dashed fan edges replaced with
  one dashed command-surface sideband box (was piercing the cmd-path box)
- pumice 01_block_diagram: invtrapezium
- pumice generate_{has,mas}_pdf.sh REV defaults synced to books
  (1.0-draft / 0.9-draft); stale DDR2_LPDDR2_HAS_v0.9.{pdf,docx} removed
- regenerated PDFs: family HAS, common MAS, pumice HAS
</commit_message>
<xml_diff>
--- a/projects/components/mem-ctrl-ip/common-ip/docs/mem_ctrl_ip_family_HAS_v0.1.docx
+++ b/projects/components/mem-ctrl-ip/common-ip/docs/mem_ctrl_ip_family_HAS_v0.1.docx
@@ -122,7 +122,7 @@
             </w:rPr>
             <w:fldChar w:fldCharType="separate"/>
           </w:r>
-          <w:hyperlink w:anchor="__RefHeading___Toc2576_1926919148">
+          <w:hyperlink w:anchor="__RefHeading___Toc2576_2309175800">
             <w:r>
               <w:rPr>
                 <w:webHidden/>
@@ -143,7 +143,7 @@
             </w:tabs>
             <w:rPr/>
           </w:pPr>
-          <w:hyperlink w:anchor="__RefHeading___Toc2578_1926919148">
+          <w:hyperlink w:anchor="__RefHeading___Toc2578_2309175800">
             <w:r>
               <w:rPr>
                 <w:webHidden/>
@@ -164,7 +164,7 @@
             </w:tabs>
             <w:rPr/>
           </w:pPr>
-          <w:hyperlink w:anchor="__RefHeading___Toc2580_1926919148">
+          <w:hyperlink w:anchor="__RefHeading___Toc2580_2309175800">
             <w:r>
               <w:rPr>
                 <w:webHidden/>
@@ -185,7 +185,7 @@
             </w:tabs>
             <w:rPr/>
           </w:pPr>
-          <w:hyperlink w:anchor="__RefHeading___Toc2582_1926919148">
+          <w:hyperlink w:anchor="__RefHeading___Toc2582_2309175800">
             <w:r>
               <w:rPr>
                 <w:webHidden/>
@@ -206,7 +206,7 @@
             </w:tabs>
             <w:rPr/>
           </w:pPr>
-          <w:hyperlink w:anchor="__RefHeading___Toc2584_1926919148">
+          <w:hyperlink w:anchor="__RefHeading___Toc2584_2309175800">
             <w:r>
               <w:rPr>
                 <w:webHidden/>
@@ -227,7 +227,7 @@
             </w:tabs>
             <w:rPr/>
           </w:pPr>
-          <w:hyperlink w:anchor="__RefHeading___Toc2586_1926919148">
+          <w:hyperlink w:anchor="__RefHeading___Toc2586_2309175800">
             <w:r>
               <w:rPr>
                 <w:webHidden/>
@@ -248,7 +248,7 @@
             </w:tabs>
             <w:rPr/>
           </w:pPr>
-          <w:hyperlink w:anchor="__RefHeading___Toc2588_1926919148">
+          <w:hyperlink w:anchor="__RefHeading___Toc2588_2309175800">
             <w:r>
               <w:rPr>
                 <w:webHidden/>
@@ -269,7 +269,7 @@
             </w:tabs>
             <w:rPr/>
           </w:pPr>
-          <w:hyperlink w:anchor="__RefHeading___Toc2590_1926919148">
+          <w:hyperlink w:anchor="__RefHeading___Toc2590_2309175800">
             <w:r>
               <w:rPr>
                 <w:webHidden/>
@@ -290,7 +290,7 @@
             </w:tabs>
             <w:rPr/>
           </w:pPr>
-          <w:hyperlink w:anchor="__RefHeading___Toc2592_1926919148">
+          <w:hyperlink w:anchor="__RefHeading___Toc2592_2309175800">
             <w:r>
               <w:rPr>
                 <w:webHidden/>
@@ -311,7 +311,7 @@
             </w:tabs>
             <w:rPr/>
           </w:pPr>
-          <w:hyperlink w:anchor="__RefHeading___Toc2594_1926919148">
+          <w:hyperlink w:anchor="__RefHeading___Toc2594_2309175800">
             <w:r>
               <w:rPr>
                 <w:webHidden/>
@@ -332,7 +332,7 @@
             </w:tabs>
             <w:rPr/>
           </w:pPr>
-          <w:hyperlink w:anchor="__RefHeading___Toc2596_1926919148">
+          <w:hyperlink w:anchor="__RefHeading___Toc2596_2309175800">
             <w:r>
               <w:rPr>
                 <w:webHidden/>
@@ -353,7 +353,7 @@
             </w:tabs>
             <w:rPr/>
           </w:pPr>
-          <w:hyperlink w:anchor="__RefHeading___Toc2598_1926919148">
+          <w:hyperlink w:anchor="__RefHeading___Toc2598_2309175800">
             <w:r>
               <w:rPr>
                 <w:webHidden/>
@@ -374,7 +374,7 @@
             </w:tabs>
             <w:rPr/>
           </w:pPr>
-          <w:hyperlink w:anchor="__RefHeading___Toc2600_1926919148">
+          <w:hyperlink w:anchor="__RefHeading___Toc2600_2309175800">
             <w:r>
               <w:rPr>
                 <w:webHidden/>
@@ -395,7 +395,7 @@
             </w:tabs>
             <w:rPr/>
           </w:pPr>
-          <w:hyperlink w:anchor="__RefHeading___Toc2602_1926919148">
+          <w:hyperlink w:anchor="__RefHeading___Toc2602_2309175800">
             <w:r>
               <w:rPr>
                 <w:webHidden/>
@@ -416,7 +416,7 @@
             </w:tabs>
             <w:rPr/>
           </w:pPr>
-          <w:hyperlink w:anchor="__RefHeading___Toc2604_1926919148">
+          <w:hyperlink w:anchor="__RefHeading___Toc2604_2309175800">
             <w:r>
               <w:rPr>
                 <w:webHidden/>
@@ -437,7 +437,7 @@
             </w:tabs>
             <w:rPr/>
           </w:pPr>
-          <w:hyperlink w:anchor="__RefHeading___Toc2606_1926919148">
+          <w:hyperlink w:anchor="__RefHeading___Toc2606_2309175800">
             <w:r>
               <w:rPr>
                 <w:webHidden/>
@@ -458,7 +458,7 @@
             </w:tabs>
             <w:rPr/>
           </w:pPr>
-          <w:hyperlink w:anchor="__RefHeading___Toc2608_1926919148">
+          <w:hyperlink w:anchor="__RefHeading___Toc2608_2309175800">
             <w:r>
               <w:rPr>
                 <w:webHidden/>
@@ -479,7 +479,7 @@
             </w:tabs>
             <w:rPr/>
           </w:pPr>
-          <w:hyperlink w:anchor="__RefHeading___Toc2610_1926919148">
+          <w:hyperlink w:anchor="__RefHeading___Toc2610_2309175800">
             <w:r>
               <w:rPr>
                 <w:webHidden/>
@@ -500,7 +500,7 @@
             </w:tabs>
             <w:rPr/>
           </w:pPr>
-          <w:hyperlink w:anchor="__RefHeading___Toc2612_1926919148">
+          <w:hyperlink w:anchor="__RefHeading___Toc2612_2309175800">
             <w:r>
               <w:rPr>
                 <w:webHidden/>
@@ -521,7 +521,7 @@
             </w:tabs>
             <w:rPr/>
           </w:pPr>
-          <w:hyperlink w:anchor="__RefHeading___Toc2614_1926919148">
+          <w:hyperlink w:anchor="__RefHeading___Toc2614_2309175800">
             <w:r>
               <w:rPr>
                 <w:webHidden/>
@@ -542,7 +542,7 @@
             </w:tabs>
             <w:rPr/>
           </w:pPr>
-          <w:hyperlink w:anchor="__RefHeading___Toc2616_1926919148">
+          <w:hyperlink w:anchor="__RefHeading___Toc2616_2309175800">
             <w:r>
               <w:rPr>
                 <w:webHidden/>
@@ -563,7 +563,7 @@
             </w:tabs>
             <w:rPr/>
           </w:pPr>
-          <w:hyperlink w:anchor="__RefHeading___Toc2618_1926919148">
+          <w:hyperlink w:anchor="__RefHeading___Toc2618_2309175800">
             <w:r>
               <w:rPr>
                 <w:webHidden/>
@@ -584,7 +584,7 @@
             </w:tabs>
             <w:rPr/>
           </w:pPr>
-          <w:hyperlink w:anchor="__RefHeading___Toc2620_1926919148">
+          <w:hyperlink w:anchor="__RefHeading___Toc2620_2309175800">
             <w:r>
               <w:rPr>
                 <w:webHidden/>
@@ -605,7 +605,7 @@
             </w:tabs>
             <w:rPr/>
           </w:pPr>
-          <w:hyperlink w:anchor="__RefHeading___Toc2622_1926919148">
+          <w:hyperlink w:anchor="__RefHeading___Toc2622_2309175800">
             <w:r>
               <w:rPr>
                 <w:webHidden/>
@@ -626,7 +626,7 @@
             </w:tabs>
             <w:rPr/>
           </w:pPr>
-          <w:hyperlink w:anchor="__RefHeading___Toc2624_1926919148">
+          <w:hyperlink w:anchor="__RefHeading___Toc2624_2309175800">
             <w:r>
               <w:rPr>
                 <w:webHidden/>
@@ -647,7 +647,7 @@
             </w:tabs>
             <w:rPr/>
           </w:pPr>
-          <w:hyperlink w:anchor="__RefHeading___Toc2626_1926919148">
+          <w:hyperlink w:anchor="__RefHeading___Toc2626_2309175800">
             <w:r>
               <w:rPr>
                 <w:webHidden/>
@@ -668,7 +668,7 @@
             </w:tabs>
             <w:rPr/>
           </w:pPr>
-          <w:hyperlink w:anchor="__RefHeading___Toc2628_1926919148">
+          <w:hyperlink w:anchor="__RefHeading___Toc2628_2309175800">
             <w:r>
               <w:rPr>
                 <w:webHidden/>
@@ -689,7 +689,7 @@
             </w:tabs>
             <w:rPr/>
           </w:pPr>
-          <w:hyperlink w:anchor="__RefHeading___Toc2630_1926919148">
+          <w:hyperlink w:anchor="__RefHeading___Toc2630_2309175800">
             <w:r>
               <w:rPr>
                 <w:webHidden/>
@@ -710,7 +710,7 @@
             </w:tabs>
             <w:rPr/>
           </w:pPr>
-          <w:hyperlink w:anchor="__RefHeading___Toc2632_1926919148">
+          <w:hyperlink w:anchor="__RefHeading___Toc2632_2309175800">
             <w:r>
               <w:rPr>
                 <w:webHidden/>
@@ -731,7 +731,7 @@
             </w:tabs>
             <w:rPr/>
           </w:pPr>
-          <w:hyperlink w:anchor="__RefHeading___Toc2634_1926919148">
+          <w:hyperlink w:anchor="__RefHeading___Toc2634_2309175800">
             <w:r>
               <w:rPr>
                 <w:webHidden/>
@@ -752,7 +752,7 @@
             </w:tabs>
             <w:rPr/>
           </w:pPr>
-          <w:hyperlink w:anchor="__RefHeading___Toc2636_1926919148">
+          <w:hyperlink w:anchor="__RefHeading___Toc2636_2309175800">
             <w:r>
               <w:rPr>
                 <w:webHidden/>
@@ -773,7 +773,7 @@
             </w:tabs>
             <w:rPr/>
           </w:pPr>
-          <w:hyperlink w:anchor="__RefHeading___Toc2638_1926919148">
+          <w:hyperlink w:anchor="__RefHeading___Toc2638_2309175800">
             <w:r>
               <w:rPr>
                 <w:webHidden/>
@@ -794,7 +794,7 @@
             </w:tabs>
             <w:rPr/>
           </w:pPr>
-          <w:hyperlink w:anchor="__RefHeading___Toc2640_1926919148">
+          <w:hyperlink w:anchor="__RefHeading___Toc2640_2309175800">
             <w:r>
               <w:rPr>
                 <w:webHidden/>
@@ -815,7 +815,7 @@
             </w:tabs>
             <w:rPr/>
           </w:pPr>
-          <w:hyperlink w:anchor="__RefHeading___Toc2642_1926919148">
+          <w:hyperlink w:anchor="__RefHeading___Toc2642_2309175800">
             <w:r>
               <w:rPr>
                 <w:webHidden/>
@@ -836,7 +836,7 @@
             </w:tabs>
             <w:rPr/>
           </w:pPr>
-          <w:hyperlink w:anchor="__RefHeading___Toc2644_1926919148">
+          <w:hyperlink w:anchor="__RefHeading___Toc2644_2309175800">
             <w:r>
               <w:rPr>
                 <w:webHidden/>
@@ -857,7 +857,7 @@
             </w:tabs>
             <w:rPr/>
           </w:pPr>
-          <w:hyperlink w:anchor="__RefHeading___Toc2646_1926919148">
+          <w:hyperlink w:anchor="__RefHeading___Toc2646_2309175800">
             <w:r>
               <w:rPr>
                 <w:webHidden/>
@@ -878,7 +878,7 @@
             </w:tabs>
             <w:rPr/>
           </w:pPr>
-          <w:hyperlink w:anchor="__RefHeading___Toc2648_1926919148">
+          <w:hyperlink w:anchor="__RefHeading___Toc2648_2309175800">
             <w:r>
               <w:rPr>
                 <w:webHidden/>
@@ -899,7 +899,7 @@
             </w:tabs>
             <w:rPr/>
           </w:pPr>
-          <w:hyperlink w:anchor="__RefHeading___Toc2650_1926919148">
+          <w:hyperlink w:anchor="__RefHeading___Toc2650_2309175800">
             <w:r>
               <w:rPr>
                 <w:webHidden/>
@@ -920,7 +920,7 @@
             </w:tabs>
             <w:rPr/>
           </w:pPr>
-          <w:hyperlink w:anchor="__RefHeading___Toc2652_1926919148">
+          <w:hyperlink w:anchor="__RefHeading___Toc2652_2309175800">
             <w:r>
               <w:rPr>
                 <w:webHidden/>
@@ -941,7 +941,7 @@
             </w:tabs>
             <w:rPr/>
           </w:pPr>
-          <w:hyperlink w:anchor="__RefHeading___Toc2654_1926919148">
+          <w:hyperlink w:anchor="__RefHeading___Toc2654_2309175800">
             <w:r>
               <w:rPr>
                 <w:webHidden/>
@@ -962,7 +962,7 @@
             </w:tabs>
             <w:rPr/>
           </w:pPr>
-          <w:hyperlink w:anchor="__RefHeading___Toc2656_1926919148">
+          <w:hyperlink w:anchor="__RefHeading___Toc2656_2309175800">
             <w:r>
               <w:rPr>
                 <w:webHidden/>
@@ -983,7 +983,7 @@
             </w:tabs>
             <w:rPr/>
           </w:pPr>
-          <w:hyperlink w:anchor="__RefHeading___Toc2658_1926919148">
+          <w:hyperlink w:anchor="__RefHeading___Toc2658_2309175800">
             <w:r>
               <w:rPr>
                 <w:webHidden/>
@@ -1004,7 +1004,7 @@
             </w:tabs>
             <w:rPr/>
           </w:pPr>
-          <w:hyperlink w:anchor="__RefHeading___Toc2660_1926919148">
+          <w:hyperlink w:anchor="__RefHeading___Toc2660_2309175800">
             <w:r>
               <w:rPr>
                 <w:webHidden/>
@@ -1025,7 +1025,7 @@
             </w:tabs>
             <w:rPr/>
           </w:pPr>
-          <w:hyperlink w:anchor="__RefHeading___Toc2662_1926919148">
+          <w:hyperlink w:anchor="__RefHeading___Toc2662_2309175800">
             <w:r>
               <w:rPr>
                 <w:webHidden/>
@@ -1046,7 +1046,7 @@
             </w:tabs>
             <w:rPr/>
           </w:pPr>
-          <w:hyperlink w:anchor="__RefHeading___Toc2664_1926919148">
+          <w:hyperlink w:anchor="__RefHeading___Toc2664_2309175800">
             <w:r>
               <w:rPr>
                 <w:webHidden/>
@@ -1067,7 +1067,7 @@
             </w:tabs>
             <w:rPr/>
           </w:pPr>
-          <w:hyperlink w:anchor="__RefHeading___Toc2666_1926919148">
+          <w:hyperlink w:anchor="__RefHeading___Toc2666_2309175800">
             <w:r>
               <w:rPr>
                 <w:webHidden/>
@@ -1088,7 +1088,7 @@
             </w:tabs>
             <w:rPr/>
           </w:pPr>
-          <w:hyperlink w:anchor="__RefHeading___Toc2668_1926919148">
+          <w:hyperlink w:anchor="__RefHeading___Toc2668_2309175800">
             <w:r>
               <w:rPr>
                 <w:webHidden/>
@@ -1109,7 +1109,7 @@
             </w:tabs>
             <w:rPr/>
           </w:pPr>
-          <w:hyperlink w:anchor="__RefHeading___Toc2670_1926919148">
+          <w:hyperlink w:anchor="__RefHeading___Toc2670_2309175800">
             <w:r>
               <w:rPr>
                 <w:webHidden/>
@@ -1130,7 +1130,7 @@
             </w:tabs>
             <w:rPr/>
           </w:pPr>
-          <w:hyperlink w:anchor="__RefHeading___Toc2672_1926919148">
+          <w:hyperlink w:anchor="__RefHeading___Toc2672_2309175800">
             <w:r>
               <w:rPr>
                 <w:webHidden/>
@@ -1151,7 +1151,7 @@
             </w:tabs>
             <w:rPr/>
           </w:pPr>
-          <w:hyperlink w:anchor="__RefHeading___Toc2674_1926919148">
+          <w:hyperlink w:anchor="__RefHeading___Toc2674_2309175800">
             <w:r>
               <w:rPr>
                 <w:webHidden/>
@@ -1172,7 +1172,7 @@
             </w:tabs>
             <w:rPr/>
           </w:pPr>
-          <w:hyperlink w:anchor="__RefHeading___Toc2676_1926919148">
+          <w:hyperlink w:anchor="__RefHeading___Toc2676_2309175800">
             <w:r>
               <w:rPr>
                 <w:webHidden/>
@@ -1193,7 +1193,7 @@
             </w:tabs>
             <w:rPr/>
           </w:pPr>
-          <w:hyperlink w:anchor="__RefHeading___Toc2678_1926919148">
+          <w:hyperlink w:anchor="__RefHeading___Toc2678_2309175800">
             <w:r>
               <w:rPr>
                 <w:webHidden/>
@@ -1316,7 +1316,7 @@
         <w:spacing w:before="0" w:after="120"/>
         <w:rPr/>
       </w:pPr>
-      <w:bookmarkStart w:id="2" w:name="__RefHeading___Toc2576_1926919148"/>
+      <w:bookmarkStart w:id="2" w:name="__RefHeading___Toc2576_2309175800"/>
       <w:bookmarkEnd w:id="2"/>
       <w:r>
         <w:rPr>
@@ -1354,7 +1354,7 @@
         <w:rPr>
           <w:sz w:val="20"/>
         </w:rPr>
-        <w:t xml:space="preserve"> 2026-10-10</w:t>
+        <w:t xml:space="preserve"> 2026-10-11</w:t>
       </w:r>
     </w:p>
     <w:p>
@@ -1454,7 +1454,7 @@
         <w:spacing w:before="360" w:after="120"/>
         <w:rPr/>
       </w:pPr>
-      <w:bookmarkStart w:id="4" w:name="__RefHeading___Toc2578_1926919148"/>
+      <w:bookmarkStart w:id="4" w:name="__RefHeading___Toc2578_2309175800"/>
       <w:bookmarkStart w:id="5" w:name="X616197512f394804f2fbf1774110e6f38740946"/>
       <w:bookmarkEnd w:id="4"/>
       <w:r>
@@ -1655,7 +1655,7 @@
         <w:spacing w:before="280" w:after="80"/>
         <w:rPr/>
       </w:pPr>
-      <w:bookmarkStart w:id="6" w:name="__RefHeading___Toc2580_1926919148"/>
+      <w:bookmarkStart w:id="6" w:name="__RefHeading___Toc2580_2309175800"/>
       <w:bookmarkStart w:id="7" w:name="document-organization"/>
       <w:bookmarkEnd w:id="6"/>
       <w:r>
@@ -1703,7 +1703,7 @@
         <w:spacing w:before="200" w:after="80"/>
         <w:rPr/>
       </w:pPr>
-      <w:bookmarkStart w:id="8" w:name="__RefHeading___Toc2582_1926919148"/>
+      <w:bookmarkStart w:id="8" w:name="__RefHeading___Toc2582_2309175800"/>
       <w:bookmarkStart w:id="9" w:name="front-matter"/>
       <w:bookmarkEnd w:id="8"/>
       <w:r>
@@ -1751,7 +1751,7 @@
         <w:spacing w:before="200" w:after="80"/>
         <w:rPr/>
       </w:pPr>
-      <w:bookmarkStart w:id="11" w:name="__RefHeading___Toc2584_1926919148"/>
+      <w:bookmarkStart w:id="11" w:name="__RefHeading___Toc2584_2309175800"/>
       <w:bookmarkStart w:id="12" w:name="chapter-1-the-family-package"/>
       <w:bookmarkEnd w:id="11"/>
       <w:r>
@@ -1807,7 +1807,7 @@
         <w:spacing w:before="200" w:after="80"/>
         <w:rPr/>
       </w:pPr>
-      <w:bookmarkStart w:id="13" w:name="__RefHeading___Toc2586_1926919148"/>
+      <w:bookmarkStart w:id="13" w:name="__RefHeading___Toc2586_2309175800"/>
       <w:bookmarkStart w:id="14" w:name="Xe73b40f1192db0acd779fe60e75b80c1263b700"/>
       <w:bookmarkEnd w:id="13"/>
       <w:r>
@@ -1880,7 +1880,7 @@
         <w:spacing w:before="200" w:after="80"/>
         <w:rPr/>
       </w:pPr>
-      <w:bookmarkStart w:id="15" w:name="__RefHeading___Toc2588_1926919148"/>
+      <w:bookmarkStart w:id="15" w:name="__RefHeading___Toc2588_2309175800"/>
       <w:bookmarkStart w:id="16" w:name="Xfd03914965c1a36c753d69373597a3edba6d3ba"/>
       <w:bookmarkEnd w:id="15"/>
       <w:r>
@@ -1953,7 +1953,7 @@
         <w:spacing w:before="200" w:after="80"/>
         <w:rPr/>
       </w:pPr>
-      <w:bookmarkStart w:id="17" w:name="__RefHeading___Toc2590_1926919148"/>
+      <w:bookmarkStart w:id="17" w:name="__RefHeading___Toc2590_2309175800"/>
       <w:bookmarkStart w:id="18" w:name="Xae2fb05cfd41b92d952510e81a7f289f9208afe"/>
       <w:bookmarkEnd w:id="17"/>
       <w:r>
@@ -2026,7 +2026,7 @@
         <w:spacing w:before="200" w:after="80"/>
         <w:rPr/>
       </w:pPr>
-      <w:bookmarkStart w:id="19" w:name="__RefHeading___Toc2592_1926919148"/>
+      <w:bookmarkStart w:id="19" w:name="__RefHeading___Toc2592_2309175800"/>
       <w:bookmarkStart w:id="20" w:name="chapter-5-mc_training_layer"/>
       <w:bookmarkEnd w:id="19"/>
       <w:r>
@@ -2091,7 +2091,7 @@
         <w:spacing w:before="200" w:after="80"/>
         <w:rPr/>
       </w:pPr>
-      <w:bookmarkStart w:id="21" w:name="__RefHeading___Toc2594_1926919148"/>
+      <w:bookmarkStart w:id="21" w:name="__RefHeading___Toc2594_2309175800"/>
       <w:bookmarkStart w:id="22" w:name="chapter-6-mc_ras_layer"/>
       <w:bookmarkEnd w:id="21"/>
       <w:r>
@@ -2156,7 +2156,7 @@
         <w:spacing w:before="200" w:after="80"/>
         <w:rPr/>
       </w:pPr>
-      <w:bookmarkStart w:id="23" w:name="__RefHeading___Toc2596_1926919148"/>
+      <w:bookmarkStart w:id="23" w:name="__RefHeading___Toc2596_2309175800"/>
       <w:bookmarkStart w:id="24" w:name="X6b7ef090e93368a3c74775085b7d22e8fdb9bc1"/>
       <w:bookmarkEnd w:id="23"/>
       <w:r>
@@ -2229,7 +2229,7 @@
         <w:spacing w:before="200" w:after="80"/>
         <w:rPr/>
       </w:pPr>
-      <w:bookmarkStart w:id="25" w:name="__RefHeading___Toc2598_1926919148"/>
+      <w:bookmarkStart w:id="25" w:name="__RefHeading___Toc2598_2309175800"/>
       <w:bookmarkStart w:id="26" w:name="chapter-8-mc_dfi_3p1_layer"/>
       <w:bookmarkEnd w:id="25"/>
       <w:r>
@@ -2294,7 +2294,7 @@
         <w:spacing w:before="200" w:after="80"/>
         <w:rPr/>
       </w:pPr>
-      <w:bookmarkStart w:id="27" w:name="__RefHeading___Toc2600_1926919148"/>
+      <w:bookmarkStart w:id="27" w:name="__RefHeading___Toc2600_2309175800"/>
       <w:bookmarkStart w:id="28" w:name="chapter-9-mc_dfi_4p0_layer"/>
       <w:bookmarkEnd w:id="27"/>
       <w:r>
@@ -2453,7 +2453,7 @@
         <w:spacing w:before="360" w:after="120"/>
         <w:rPr/>
       </w:pPr>
-      <w:bookmarkStart w:id="32" w:name="__RefHeading___Toc2602_1926919148"/>
+      <w:bookmarkStart w:id="32" w:name="__RefHeading___Toc2602_2309175800"/>
       <w:bookmarkStart w:id="33" w:name="document-information"/>
       <w:bookmarkEnd w:id="32"/>
       <w:r>
@@ -3036,7 +3036,7 @@
         <w:spacing w:before="280" w:after="80"/>
         <w:rPr/>
       </w:pPr>
-      <w:bookmarkStart w:id="34" w:name="__RefHeading___Toc2604_1926919148"/>
+      <w:bookmarkStart w:id="34" w:name="__RefHeading___Toc2604_2309175800"/>
       <w:bookmarkEnd w:id="34"/>
       <w:r>
         <w:rPr>
@@ -3319,7 +3319,7 @@
         <w:spacing w:before="280" w:after="80"/>
         <w:rPr/>
       </w:pPr>
-      <w:bookmarkStart w:id="35" w:name="__RefHeading___Toc2606_1926919148"/>
+      <w:bookmarkStart w:id="35" w:name="__RefHeading___Toc2606_2309175800"/>
       <w:bookmarkEnd w:id="35"/>
       <w:r>
         <w:rPr>
@@ -3871,7 +3871,7 @@
         <w:spacing w:before="360" w:after="120"/>
         <w:rPr/>
       </w:pPr>
-      <w:bookmarkStart w:id="37" w:name="__RefHeading___Toc2608_1926919148"/>
+      <w:bookmarkStart w:id="37" w:name="__RefHeading___Toc2608_2309175800"/>
       <w:bookmarkStart w:id="38" w:name="purpose-scope-and-the-two-lines"/>
       <w:bookmarkEnd w:id="37"/>
       <w:r>
@@ -3902,7 +3902,7 @@
         <w:spacing w:before="280" w:after="80"/>
         <w:rPr/>
       </w:pPr>
-      <w:bookmarkStart w:id="39" w:name="__RefHeading___Toc2610_1926919148"/>
+      <w:bookmarkStart w:id="39" w:name="__RefHeading___Toc2610_2309175800"/>
       <w:bookmarkStart w:id="40" w:name="purpose"/>
       <w:bookmarkEnd w:id="39"/>
       <w:r>
@@ -4056,7 +4056,7 @@
         <w:spacing w:before="280" w:after="80"/>
         <w:rPr/>
       </w:pPr>
-      <w:bookmarkStart w:id="41" w:name="__RefHeading___Toc2612_1926919148"/>
+      <w:bookmarkStart w:id="41" w:name="__RefHeading___Toc2612_2309175800"/>
       <w:bookmarkStart w:id="42" w:name="X02b33bbc1801cd189339d45a688fcaae9520a66"/>
       <w:bookmarkEnd w:id="41"/>
       <w:r>
@@ -4139,7 +4139,7 @@
         <w:spacing w:before="280" w:after="80"/>
         <w:rPr/>
       </w:pPr>
-      <w:bookmarkStart w:id="43" w:name="__RefHeading___Toc2614_1926919148"/>
+      <w:bookmarkStart w:id="43" w:name="__RefHeading___Toc2614_2309175800"/>
       <w:bookmarkStart w:id="44" w:name="the-two-lines-research-and-product"/>
       <w:bookmarkEnd w:id="43"/>
       <w:r>
@@ -4251,7 +4251,7 @@
         <w:spacing w:before="280" w:after="80"/>
         <w:rPr/>
       </w:pPr>
-      <w:bookmarkStart w:id="45" w:name="__RefHeading___Toc2616_1926919148"/>
+      <w:bookmarkStart w:id="45" w:name="__RefHeading___Toc2616_2309175800"/>
       <w:bookmarkStart w:id="46" w:name="what-this-book-binds"/>
       <w:bookmarkEnd w:id="45"/>
       <w:r>
@@ -4396,7 +4396,7 @@
         <w:spacing w:before="280" w:after="80"/>
         <w:rPr/>
       </w:pPr>
-      <w:bookmarkStart w:id="48" w:name="__RefHeading___Toc2618_1926919148"/>
+      <w:bookmarkStart w:id="48" w:name="__RefHeading___Toc2618_2309175800"/>
       <w:bookmarkStart w:id="49" w:name="conventions"/>
       <w:bookmarkEnd w:id="48"/>
       <w:r>
@@ -4529,7 +4529,7 @@
         <w:spacing w:before="360" w:after="120"/>
         <w:rPr/>
       </w:pPr>
-      <w:bookmarkStart w:id="52" w:name="__RefHeading___Toc2620_1926919148"/>
+      <w:bookmarkStart w:id="52" w:name="__RefHeading___Toc2620_2309175800"/>
       <w:bookmarkStart w:id="53" w:name="X35fb09d53ce58ee1df67816bcaac5b674efa180"/>
       <w:bookmarkEnd w:id="52"/>
       <w:r>
@@ -4586,7 +4586,7 @@
         <w:rPr/>
         <w:drawing>
           <wp:inline distT="0" distB="0" distL="0" distR="0">
-            <wp:extent cx="5334000" cy="2287270"/>
+            <wp:extent cx="5334000" cy="2839720"/>
             <wp:effectExtent l="0" t="0" r="0" b="0"/>
             <wp:docPr id="11" name="Picture" descr="The mem-ctrl-ip whole unit — AXI channels at top, the layer stack in the middle, DDR PHY bar at the bottom"/>
             <wp:cNvGraphicFramePr>
@@ -4610,7 +4610,7 @@
                   <pic:spPr bwMode="auto">
                     <a:xfrm>
                       <a:off x="0" y="0"/>
-                      <a:ext cx="5334000" cy="2287270"/>
+                      <a:ext cx="5334000" cy="2839720"/>
                     </a:xfrm>
                     <a:prstGeom prst="rect">
                       <a:avLst/>
@@ -4642,7 +4642,7 @@
         <w:spacing w:before="280" w:after="80"/>
         <w:rPr/>
       </w:pPr>
-      <w:bookmarkStart w:id="54" w:name="__RefHeading___Toc2622_1926919148"/>
+      <w:bookmarkStart w:id="54" w:name="__RefHeading___Toc2622_2309175800"/>
       <w:bookmarkEnd w:id="54"/>
       <w:r>
         <w:rPr>
@@ -5737,7 +5737,7 @@
         <w:spacing w:before="280" w:after="80"/>
         <w:rPr/>
       </w:pPr>
-      <w:bookmarkStart w:id="56" w:name="__RefHeading___Toc2624_1926919148"/>
+      <w:bookmarkStart w:id="56" w:name="__RefHeading___Toc2624_2309175800"/>
       <w:bookmarkEnd w:id="56"/>
       <w:r>
         <w:rPr>
@@ -5833,7 +5833,7 @@
         <w:spacing w:before="280" w:after="80"/>
         <w:rPr/>
       </w:pPr>
-      <w:bookmarkStart w:id="57" w:name="__RefHeading___Toc2626_1926919148"/>
+      <w:bookmarkStart w:id="57" w:name="__RefHeading___Toc2626_2309175800"/>
       <w:bookmarkStart w:id="58" w:name="the-three-structural-rules-of-the-stack"/>
       <w:bookmarkEnd w:id="57"/>
       <w:r>
@@ -5939,7 +5939,7 @@
         <w:spacing w:before="280" w:after="80"/>
         <w:rPr/>
       </w:pPr>
-      <w:bookmarkStart w:id="59" w:name="__RefHeading___Toc2628_1926919148"/>
+      <w:bookmarkStart w:id="59" w:name="__RefHeading___Toc2628_2309175800"/>
       <w:bookmarkStart w:id="60" w:name="what-the-rocks-own"/>
       <w:bookmarkEnd w:id="59"/>
       <w:r>
@@ -6086,7 +6086,7 @@
         <w:spacing w:before="360" w:after="120"/>
         <w:rPr/>
       </w:pPr>
-      <w:bookmarkStart w:id="63" w:name="__RefHeading___Toc2630_1926919148"/>
+      <w:bookmarkStart w:id="63" w:name="__RefHeading___Toc2630_2309175800"/>
       <w:bookmarkStart w:id="64" w:name="the-descriptor-seam"/>
       <w:bookmarkEnd w:id="63"/>
       <w:r>
@@ -6143,7 +6143,7 @@
         <w:spacing w:before="280" w:after="80"/>
         <w:rPr/>
       </w:pPr>
-      <w:bookmarkStart w:id="65" w:name="__RefHeading___Toc2632_1926919148"/>
+      <w:bookmarkStart w:id="65" w:name="__RefHeading___Toc2632_2309175800"/>
       <w:bookmarkStart w:id="66" w:name="the-contract"/>
       <w:bookmarkEnd w:id="65"/>
       <w:r>
@@ -6283,7 +6283,7 @@
         <w:spacing w:before="280" w:after="80"/>
         <w:rPr/>
       </w:pPr>
-      <w:bookmarkStart w:id="68" w:name="__RefHeading___Toc2634_1926919148"/>
+      <w:bookmarkStart w:id="68" w:name="__RefHeading___Toc2634_2309175800"/>
       <w:bookmarkStart w:id="69" w:name="the-invariants"/>
       <w:bookmarkEnd w:id="68"/>
       <w:r>
@@ -6390,7 +6390,7 @@
         <w:spacing w:before="280" w:after="80"/>
         <w:rPr/>
       </w:pPr>
-      <w:bookmarkStart w:id="70" w:name="__RefHeading___Toc2636_1926919148"/>
+      <w:bookmarkStart w:id="70" w:name="__RefHeading___Toc2636_2309175800"/>
       <w:bookmarkStart w:id="71" w:name="what-the-seam-is-not"/>
       <w:bookmarkEnd w:id="70"/>
       <w:r>
@@ -6517,7 +6517,7 @@
         <w:spacing w:before="280" w:after="80"/>
         <w:rPr/>
       </w:pPr>
-      <w:bookmarkStart w:id="72" w:name="__RefHeading___Toc2638_1926919148"/>
+      <w:bookmarkStart w:id="72" w:name="__RefHeading___Toc2638_2309175800"/>
       <w:bookmarkStart w:id="73" w:name="where-this-stands-in-the-rocks"/>
       <w:bookmarkEnd w:id="72"/>
       <w:r>
@@ -6663,7 +6663,7 @@
         <w:spacing w:before="360" w:after="120"/>
         <w:rPr/>
       </w:pPr>
-      <w:bookmarkStart w:id="76" w:name="__RefHeading___Toc2640_1926919148"/>
+      <w:bookmarkStart w:id="76" w:name="__RefHeading___Toc2640_2309175800"/>
       <w:bookmarkStart w:id="77" w:name="Xba0e68e539aa7351d2f5c03a115f460d02e06c0"/>
       <w:bookmarkEnd w:id="76"/>
       <w:r>
@@ -6810,7 +6810,7 @@
         <w:spacing w:before="280" w:after="80"/>
         <w:rPr/>
       </w:pPr>
-      <w:bookmarkStart w:id="78" w:name="__RefHeading___Toc2642_1926919148"/>
+      <w:bookmarkStart w:id="78" w:name="__RefHeading___Toc2642_2309175800"/>
       <w:bookmarkStart w:id="79" w:name="the-reasoning"/>
       <w:bookmarkEnd w:id="78"/>
       <w:r>
@@ -6919,7 +6919,7 @@
         <w:spacing w:before="280" w:after="80"/>
         <w:rPr/>
       </w:pPr>
-      <w:bookmarkStart w:id="80" w:name="__RefHeading___Toc2644_1926919148"/>
+      <w:bookmarkStart w:id="80" w:name="__RefHeading___Toc2644_2309175800"/>
       <w:bookmarkStart w:id="81" w:name="what-is-shared"/>
       <w:bookmarkEnd w:id="80"/>
       <w:r>
@@ -7452,7 +7452,7 @@
         <w:spacing w:before="280" w:after="80"/>
         <w:rPr/>
       </w:pPr>
-      <w:bookmarkStart w:id="82" w:name="__RefHeading___Toc2646_1926919148"/>
+      <w:bookmarkStart w:id="82" w:name="__RefHeading___Toc2646_2309175800"/>
       <w:bookmarkStart w:id="83" w:name="what-the-layer-never-does"/>
       <w:bookmarkEnd w:id="82"/>
       <w:r>
@@ -7613,7 +7613,7 @@
         <w:spacing w:before="360" w:after="120"/>
         <w:rPr/>
       </w:pPr>
-      <w:bookmarkStart w:id="86" w:name="__RefHeading___Toc2648_1926919148"/>
+      <w:bookmarkStart w:id="86" w:name="__RefHeading___Toc2648_2309175800"/>
       <w:bookmarkStart w:id="87" w:name="Xc26196f7674c66983726de17c545c6649bb3fab"/>
       <w:bookmarkEnd w:id="86"/>
       <w:r>
@@ -7670,7 +7670,7 @@
         <w:spacing w:before="280" w:after="80"/>
         <w:rPr/>
       </w:pPr>
-      <w:bookmarkStart w:id="88" w:name="__RefHeading___Toc2650_1926919148"/>
+      <w:bookmarkStart w:id="88" w:name="__RefHeading___Toc2650_2309175800"/>
       <w:bookmarkStart w:id="89" w:name="X8fa9d289b34687b6fa07df052b670cb17558661"/>
       <w:bookmarkEnd w:id="88"/>
       <w:r>
@@ -7747,7 +7747,7 @@
         <w:spacing w:before="280" w:after="80"/>
         <w:rPr/>
       </w:pPr>
-      <w:bookmarkStart w:id="90" w:name="__RefHeading___Toc2652_1926919148"/>
+      <w:bookmarkStart w:id="90" w:name="__RefHeading___Toc2652_2309175800"/>
       <w:bookmarkStart w:id="91" w:name="parameterize-width-never-personality"/>
       <w:bookmarkEnd w:id="90"/>
       <w:r>
@@ -7851,7 +7851,7 @@
         <w:spacing w:before="280" w:after="80"/>
         <w:rPr/>
       </w:pPr>
-      <w:bookmarkStart w:id="92" w:name="__RefHeading___Toc2654_1926919148"/>
+      <w:bookmarkStart w:id="92" w:name="__RefHeading___Toc2654_2309175800"/>
       <w:bookmarkStart w:id="93" w:name="X7c6b25d78360fe2e4fe81e68e87c32fcf8cda69"/>
       <w:bookmarkEnd w:id="92"/>
       <w:r>
@@ -7915,7 +7915,7 @@
         <w:spacing w:before="280" w:after="80"/>
         <w:rPr/>
       </w:pPr>
-      <w:bookmarkStart w:id="94" w:name="__RefHeading___Toc2656_1926919148"/>
+      <w:bookmarkStart w:id="94" w:name="__RefHeading___Toc2656_2309175800"/>
       <w:bookmarkStart w:id="95" w:name="X416b554ca19ee0550a4692b0d160f4e163ab46b"/>
       <w:bookmarkEnd w:id="94"/>
       <w:r>
@@ -8019,7 +8019,7 @@
         <w:spacing w:before="280" w:after="80"/>
         <w:rPr/>
       </w:pPr>
-      <w:bookmarkStart w:id="96" w:name="__RefHeading___Toc2658_1926919148"/>
+      <w:bookmarkStart w:id="96" w:name="__RefHeading___Toc2658_2309175800"/>
       <w:bookmarkStart w:id="97" w:name="X4e83b81ceef783af7b63185336af6225b7314d3"/>
       <w:bookmarkEnd w:id="96"/>
       <w:r>
@@ -8096,7 +8096,7 @@
         <w:spacing w:before="280" w:after="80"/>
         <w:rPr/>
       </w:pPr>
-      <w:bookmarkStart w:id="98" w:name="__RefHeading___Toc2660_1926919148"/>
+      <w:bookmarkStart w:id="98" w:name="__RefHeading___Toc2660_2309175800"/>
       <w:bookmarkStart w:id="99" w:name="Xb3a20a7d499f0a0ca4e9f419fb6dadc4bc8a470"/>
       <w:bookmarkEnd w:id="98"/>
       <w:r>
@@ -8249,7 +8249,7 @@
         <w:spacing w:before="360" w:after="120"/>
         <w:rPr/>
       </w:pPr>
-      <w:bookmarkStart w:id="102" w:name="__RefHeading___Toc2662_1926919148"/>
+      <w:bookmarkStart w:id="102" w:name="__RefHeading___Toc2662_2309175800"/>
       <w:bookmarkStart w:id="103" w:name="the-common-ip-layout"/>
       <w:bookmarkEnd w:id="102"/>
       <w:r>
@@ -8394,7 +8394,7 @@
         <w:spacing w:before="280" w:after="80"/>
         <w:rPr/>
       </w:pPr>
-      <w:bookmarkStart w:id="104" w:name="__RefHeading___Toc2664_1926919148"/>
+      <w:bookmarkStart w:id="104" w:name="__RefHeading___Toc2664_2309175800"/>
       <w:bookmarkStart w:id="105" w:name="the-blocks-as-of-2026-10-10"/>
       <w:bookmarkEnd w:id="104"/>
       <w:r>
@@ -9670,7 +9670,7 @@
         <w:spacing w:before="280" w:after="80"/>
         <w:rPr/>
       </w:pPr>
-      <w:bookmarkStart w:id="106" w:name="__RefHeading___Toc2666_1926919148"/>
+      <w:bookmarkStart w:id="106" w:name="__RefHeading___Toc2666_2309175800"/>
       <w:bookmarkStart w:id="107" w:name="X2611791d1bdfcecec1bf22dcc222e0c21c9b431"/>
       <w:bookmarkEnd w:id="106"/>
       <w:r>
@@ -9715,7 +9715,7 @@
         <w:spacing w:before="280" w:after="80"/>
         <w:rPr/>
       </w:pPr>
-      <w:bookmarkStart w:id="109" w:name="__RefHeading___Toc2668_1926919148"/>
+      <w:bookmarkStart w:id="109" w:name="__RefHeading___Toc2668_2309175800"/>
       <w:bookmarkStart w:id="110" w:name="documentation-map"/>
       <w:bookmarkEnd w:id="109"/>
       <w:r>
@@ -10491,7 +10491,7 @@
         <w:spacing w:before="360" w:after="120"/>
         <w:rPr/>
       </w:pPr>
-      <w:bookmarkStart w:id="113" w:name="__RefHeading___Toc2670_1926919148"/>
+      <w:bookmarkStart w:id="113" w:name="__RefHeading___Toc2670_2309175800"/>
       <w:bookmarkStart w:id="114" w:name="Xec01d7fcc00e62d53b5638288c846d5a89df379"/>
       <w:bookmarkEnd w:id="113"/>
       <w:r>
@@ -10534,7 +10534,7 @@
         <w:spacing w:before="280" w:after="80"/>
         <w:rPr/>
       </w:pPr>
-      <w:bookmarkStart w:id="115" w:name="__RefHeading___Toc2672_1926919148"/>
+      <w:bookmarkStart w:id="115" w:name="__RefHeading___Toc2672_2309175800"/>
       <w:bookmarkStart w:id="116" w:name="the-product-names"/>
       <w:bookmarkEnd w:id="115"/>
       <w:r>
@@ -11137,7 +11137,7 @@
         <w:spacing w:before="280" w:after="80"/>
         <w:rPr/>
       </w:pPr>
-      <w:bookmarkStart w:id="118" w:name="__RefHeading___Toc2674_1926919148"/>
+      <w:bookmarkStart w:id="118" w:name="__RefHeading___Toc2674_2309175800"/>
       <w:bookmarkStart w:id="119" w:name="Xa16f4717d14061f81a0dc9a449617a75cce903a"/>
       <w:bookmarkEnd w:id="118"/>
       <w:r>
@@ -11296,7 +11296,7 @@
         <w:spacing w:before="280" w:after="80"/>
         <w:rPr/>
       </w:pPr>
-      <w:bookmarkStart w:id="120" w:name="__RefHeading___Toc2676_1926919148"/>
+      <w:bookmarkStart w:id="120" w:name="__RefHeading___Toc2676_2309175800"/>
       <w:bookmarkStart w:id="121" w:name="the-research-lines-role"/>
       <w:bookmarkEnd w:id="120"/>
       <w:r>
@@ -11341,7 +11341,7 @@
         <w:spacing w:before="280" w:after="80"/>
         <w:rPr/>
       </w:pPr>
-      <w:bookmarkStart w:id="123" w:name="__RefHeading___Toc2678_1926919148"/>
+      <w:bookmarkStart w:id="123" w:name="__RefHeading___Toc2678_2309175800"/>
       <w:bookmarkStart w:id="124" w:name="relationship-to-the-rocks-books"/>
       <w:bookmarkEnd w:id="123"/>
       <w:r>

</xml_diff>

<commit_message>
docs(mem-ctrl): regenerate family HAS + common MAS PDFs (diagram label fixes)
</commit_message>
<xml_diff>
--- a/projects/components/mem-ctrl-ip/common-ip/docs/mem_ctrl_ip_family_HAS_v0.1.docx
+++ b/projects/components/mem-ctrl-ip/common-ip/docs/mem_ctrl_ip_family_HAS_v0.1.docx
@@ -122,7 +122,7 @@
             </w:rPr>
             <w:fldChar w:fldCharType="separate"/>
           </w:r>
-          <w:hyperlink w:anchor="__RefHeading___Toc2576_2309175800">
+          <w:hyperlink w:anchor="__RefHeading___Toc2576_2520221899">
             <w:r>
               <w:rPr>
                 <w:webHidden/>
@@ -143,7 +143,7 @@
             </w:tabs>
             <w:rPr/>
           </w:pPr>
-          <w:hyperlink w:anchor="__RefHeading___Toc2578_2309175800">
+          <w:hyperlink w:anchor="__RefHeading___Toc2578_2520221899">
             <w:r>
               <w:rPr>
                 <w:webHidden/>
@@ -164,7 +164,7 @@
             </w:tabs>
             <w:rPr/>
           </w:pPr>
-          <w:hyperlink w:anchor="__RefHeading___Toc2580_2309175800">
+          <w:hyperlink w:anchor="__RefHeading___Toc2580_2520221899">
             <w:r>
               <w:rPr>
                 <w:webHidden/>
@@ -185,7 +185,7 @@
             </w:tabs>
             <w:rPr/>
           </w:pPr>
-          <w:hyperlink w:anchor="__RefHeading___Toc2582_2309175800">
+          <w:hyperlink w:anchor="__RefHeading___Toc2582_2520221899">
             <w:r>
               <w:rPr>
                 <w:webHidden/>
@@ -206,7 +206,7 @@
             </w:tabs>
             <w:rPr/>
           </w:pPr>
-          <w:hyperlink w:anchor="__RefHeading___Toc2584_2309175800">
+          <w:hyperlink w:anchor="__RefHeading___Toc2584_2520221899">
             <w:r>
               <w:rPr>
                 <w:webHidden/>
@@ -227,7 +227,7 @@
             </w:tabs>
             <w:rPr/>
           </w:pPr>
-          <w:hyperlink w:anchor="__RefHeading___Toc2586_2309175800">
+          <w:hyperlink w:anchor="__RefHeading___Toc2586_2520221899">
             <w:r>
               <w:rPr>
                 <w:webHidden/>
@@ -248,7 +248,7 @@
             </w:tabs>
             <w:rPr/>
           </w:pPr>
-          <w:hyperlink w:anchor="__RefHeading___Toc2588_2309175800">
+          <w:hyperlink w:anchor="__RefHeading___Toc2588_2520221899">
             <w:r>
               <w:rPr>
                 <w:webHidden/>
@@ -269,7 +269,7 @@
             </w:tabs>
             <w:rPr/>
           </w:pPr>
-          <w:hyperlink w:anchor="__RefHeading___Toc2590_2309175800">
+          <w:hyperlink w:anchor="__RefHeading___Toc2590_2520221899">
             <w:r>
               <w:rPr>
                 <w:webHidden/>
@@ -290,7 +290,7 @@
             </w:tabs>
             <w:rPr/>
           </w:pPr>
-          <w:hyperlink w:anchor="__RefHeading___Toc2592_2309175800">
+          <w:hyperlink w:anchor="__RefHeading___Toc2592_2520221899">
             <w:r>
               <w:rPr>
                 <w:webHidden/>
@@ -311,7 +311,7 @@
             </w:tabs>
             <w:rPr/>
           </w:pPr>
-          <w:hyperlink w:anchor="__RefHeading___Toc2594_2309175800">
+          <w:hyperlink w:anchor="__RefHeading___Toc2594_2520221899">
             <w:r>
               <w:rPr>
                 <w:webHidden/>
@@ -332,7 +332,7 @@
             </w:tabs>
             <w:rPr/>
           </w:pPr>
-          <w:hyperlink w:anchor="__RefHeading___Toc2596_2309175800">
+          <w:hyperlink w:anchor="__RefHeading___Toc2596_2520221899">
             <w:r>
               <w:rPr>
                 <w:webHidden/>
@@ -353,7 +353,7 @@
             </w:tabs>
             <w:rPr/>
           </w:pPr>
-          <w:hyperlink w:anchor="__RefHeading___Toc2598_2309175800">
+          <w:hyperlink w:anchor="__RefHeading___Toc2598_2520221899">
             <w:r>
               <w:rPr>
                 <w:webHidden/>
@@ -374,7 +374,7 @@
             </w:tabs>
             <w:rPr/>
           </w:pPr>
-          <w:hyperlink w:anchor="__RefHeading___Toc2600_2309175800">
+          <w:hyperlink w:anchor="__RefHeading___Toc2600_2520221899">
             <w:r>
               <w:rPr>
                 <w:webHidden/>
@@ -395,7 +395,7 @@
             </w:tabs>
             <w:rPr/>
           </w:pPr>
-          <w:hyperlink w:anchor="__RefHeading___Toc2602_2309175800">
+          <w:hyperlink w:anchor="__RefHeading___Toc2602_2520221899">
             <w:r>
               <w:rPr>
                 <w:webHidden/>
@@ -416,7 +416,7 @@
             </w:tabs>
             <w:rPr/>
           </w:pPr>
-          <w:hyperlink w:anchor="__RefHeading___Toc2604_2309175800">
+          <w:hyperlink w:anchor="__RefHeading___Toc2604_2520221899">
             <w:r>
               <w:rPr>
                 <w:webHidden/>
@@ -437,7 +437,7 @@
             </w:tabs>
             <w:rPr/>
           </w:pPr>
-          <w:hyperlink w:anchor="__RefHeading___Toc2606_2309175800">
+          <w:hyperlink w:anchor="__RefHeading___Toc2606_2520221899">
             <w:r>
               <w:rPr>
                 <w:webHidden/>
@@ -458,7 +458,7 @@
             </w:tabs>
             <w:rPr/>
           </w:pPr>
-          <w:hyperlink w:anchor="__RefHeading___Toc2608_2309175800">
+          <w:hyperlink w:anchor="__RefHeading___Toc2608_2520221899">
             <w:r>
               <w:rPr>
                 <w:webHidden/>
@@ -479,7 +479,7 @@
             </w:tabs>
             <w:rPr/>
           </w:pPr>
-          <w:hyperlink w:anchor="__RefHeading___Toc2610_2309175800">
+          <w:hyperlink w:anchor="__RefHeading___Toc2610_2520221899">
             <w:r>
               <w:rPr>
                 <w:webHidden/>
@@ -500,7 +500,7 @@
             </w:tabs>
             <w:rPr/>
           </w:pPr>
-          <w:hyperlink w:anchor="__RefHeading___Toc2612_2309175800">
+          <w:hyperlink w:anchor="__RefHeading___Toc2612_2520221899">
             <w:r>
               <w:rPr>
                 <w:webHidden/>
@@ -521,7 +521,7 @@
             </w:tabs>
             <w:rPr/>
           </w:pPr>
-          <w:hyperlink w:anchor="__RefHeading___Toc2614_2309175800">
+          <w:hyperlink w:anchor="__RefHeading___Toc2614_2520221899">
             <w:r>
               <w:rPr>
                 <w:webHidden/>
@@ -542,7 +542,7 @@
             </w:tabs>
             <w:rPr/>
           </w:pPr>
-          <w:hyperlink w:anchor="__RefHeading___Toc2616_2309175800">
+          <w:hyperlink w:anchor="__RefHeading___Toc2616_2520221899">
             <w:r>
               <w:rPr>
                 <w:webHidden/>
@@ -563,7 +563,7 @@
             </w:tabs>
             <w:rPr/>
           </w:pPr>
-          <w:hyperlink w:anchor="__RefHeading___Toc2618_2309175800">
+          <w:hyperlink w:anchor="__RefHeading___Toc2618_2520221899">
             <w:r>
               <w:rPr>
                 <w:webHidden/>
@@ -584,7 +584,7 @@
             </w:tabs>
             <w:rPr/>
           </w:pPr>
-          <w:hyperlink w:anchor="__RefHeading___Toc2620_2309175800">
+          <w:hyperlink w:anchor="__RefHeading___Toc2620_2520221899">
             <w:r>
               <w:rPr>
                 <w:webHidden/>
@@ -605,7 +605,7 @@
             </w:tabs>
             <w:rPr/>
           </w:pPr>
-          <w:hyperlink w:anchor="__RefHeading___Toc2622_2309175800">
+          <w:hyperlink w:anchor="__RefHeading___Toc2622_2520221899">
             <w:r>
               <w:rPr>
                 <w:webHidden/>
@@ -626,7 +626,7 @@
             </w:tabs>
             <w:rPr/>
           </w:pPr>
-          <w:hyperlink w:anchor="__RefHeading___Toc2624_2309175800">
+          <w:hyperlink w:anchor="__RefHeading___Toc2624_2520221899">
             <w:r>
               <w:rPr>
                 <w:webHidden/>
@@ -647,7 +647,7 @@
             </w:tabs>
             <w:rPr/>
           </w:pPr>
-          <w:hyperlink w:anchor="__RefHeading___Toc2626_2309175800">
+          <w:hyperlink w:anchor="__RefHeading___Toc2626_2520221899">
             <w:r>
               <w:rPr>
                 <w:webHidden/>
@@ -668,7 +668,7 @@
             </w:tabs>
             <w:rPr/>
           </w:pPr>
-          <w:hyperlink w:anchor="__RefHeading___Toc2628_2309175800">
+          <w:hyperlink w:anchor="__RefHeading___Toc2628_2520221899">
             <w:r>
               <w:rPr>
                 <w:webHidden/>
@@ -689,7 +689,7 @@
             </w:tabs>
             <w:rPr/>
           </w:pPr>
-          <w:hyperlink w:anchor="__RefHeading___Toc2630_2309175800">
+          <w:hyperlink w:anchor="__RefHeading___Toc2630_2520221899">
             <w:r>
               <w:rPr>
                 <w:webHidden/>
@@ -710,7 +710,7 @@
             </w:tabs>
             <w:rPr/>
           </w:pPr>
-          <w:hyperlink w:anchor="__RefHeading___Toc2632_2309175800">
+          <w:hyperlink w:anchor="__RefHeading___Toc2632_2520221899">
             <w:r>
               <w:rPr>
                 <w:webHidden/>
@@ -731,7 +731,7 @@
             </w:tabs>
             <w:rPr/>
           </w:pPr>
-          <w:hyperlink w:anchor="__RefHeading___Toc2634_2309175800">
+          <w:hyperlink w:anchor="__RefHeading___Toc2634_2520221899">
             <w:r>
               <w:rPr>
                 <w:webHidden/>
@@ -752,7 +752,7 @@
             </w:tabs>
             <w:rPr/>
           </w:pPr>
-          <w:hyperlink w:anchor="__RefHeading___Toc2636_2309175800">
+          <w:hyperlink w:anchor="__RefHeading___Toc2636_2520221899">
             <w:r>
               <w:rPr>
                 <w:webHidden/>
@@ -773,7 +773,7 @@
             </w:tabs>
             <w:rPr/>
           </w:pPr>
-          <w:hyperlink w:anchor="__RefHeading___Toc2638_2309175800">
+          <w:hyperlink w:anchor="__RefHeading___Toc2638_2520221899">
             <w:r>
               <w:rPr>
                 <w:webHidden/>
@@ -794,7 +794,7 @@
             </w:tabs>
             <w:rPr/>
           </w:pPr>
-          <w:hyperlink w:anchor="__RefHeading___Toc2640_2309175800">
+          <w:hyperlink w:anchor="__RefHeading___Toc2640_2520221899">
             <w:r>
               <w:rPr>
                 <w:webHidden/>
@@ -815,7 +815,7 @@
             </w:tabs>
             <w:rPr/>
           </w:pPr>
-          <w:hyperlink w:anchor="__RefHeading___Toc2642_2309175800">
+          <w:hyperlink w:anchor="__RefHeading___Toc2642_2520221899">
             <w:r>
               <w:rPr>
                 <w:webHidden/>
@@ -836,7 +836,7 @@
             </w:tabs>
             <w:rPr/>
           </w:pPr>
-          <w:hyperlink w:anchor="__RefHeading___Toc2644_2309175800">
+          <w:hyperlink w:anchor="__RefHeading___Toc2644_2520221899">
             <w:r>
               <w:rPr>
                 <w:webHidden/>
@@ -857,7 +857,7 @@
             </w:tabs>
             <w:rPr/>
           </w:pPr>
-          <w:hyperlink w:anchor="__RefHeading___Toc2646_2309175800">
+          <w:hyperlink w:anchor="__RefHeading___Toc2646_2520221899">
             <w:r>
               <w:rPr>
                 <w:webHidden/>
@@ -878,7 +878,7 @@
             </w:tabs>
             <w:rPr/>
           </w:pPr>
-          <w:hyperlink w:anchor="__RefHeading___Toc2648_2309175800">
+          <w:hyperlink w:anchor="__RefHeading___Toc2648_2520221899">
             <w:r>
               <w:rPr>
                 <w:webHidden/>
@@ -899,7 +899,7 @@
             </w:tabs>
             <w:rPr/>
           </w:pPr>
-          <w:hyperlink w:anchor="__RefHeading___Toc2650_2309175800">
+          <w:hyperlink w:anchor="__RefHeading___Toc2650_2520221899">
             <w:r>
               <w:rPr>
                 <w:webHidden/>
@@ -920,7 +920,7 @@
             </w:tabs>
             <w:rPr/>
           </w:pPr>
-          <w:hyperlink w:anchor="__RefHeading___Toc2652_2309175800">
+          <w:hyperlink w:anchor="__RefHeading___Toc2652_2520221899">
             <w:r>
               <w:rPr>
                 <w:webHidden/>
@@ -941,7 +941,7 @@
             </w:tabs>
             <w:rPr/>
           </w:pPr>
-          <w:hyperlink w:anchor="__RefHeading___Toc2654_2309175800">
+          <w:hyperlink w:anchor="__RefHeading___Toc2654_2520221899">
             <w:r>
               <w:rPr>
                 <w:webHidden/>
@@ -962,7 +962,7 @@
             </w:tabs>
             <w:rPr/>
           </w:pPr>
-          <w:hyperlink w:anchor="__RefHeading___Toc2656_2309175800">
+          <w:hyperlink w:anchor="__RefHeading___Toc2656_2520221899">
             <w:r>
               <w:rPr>
                 <w:webHidden/>
@@ -983,7 +983,7 @@
             </w:tabs>
             <w:rPr/>
           </w:pPr>
-          <w:hyperlink w:anchor="__RefHeading___Toc2658_2309175800">
+          <w:hyperlink w:anchor="__RefHeading___Toc2658_2520221899">
             <w:r>
               <w:rPr>
                 <w:webHidden/>
@@ -1004,7 +1004,7 @@
             </w:tabs>
             <w:rPr/>
           </w:pPr>
-          <w:hyperlink w:anchor="__RefHeading___Toc2660_2309175800">
+          <w:hyperlink w:anchor="__RefHeading___Toc2660_2520221899">
             <w:r>
               <w:rPr>
                 <w:webHidden/>
@@ -1025,7 +1025,7 @@
             </w:tabs>
             <w:rPr/>
           </w:pPr>
-          <w:hyperlink w:anchor="__RefHeading___Toc2662_2309175800">
+          <w:hyperlink w:anchor="__RefHeading___Toc2662_2520221899">
             <w:r>
               <w:rPr>
                 <w:webHidden/>
@@ -1046,7 +1046,7 @@
             </w:tabs>
             <w:rPr/>
           </w:pPr>
-          <w:hyperlink w:anchor="__RefHeading___Toc2664_2309175800">
+          <w:hyperlink w:anchor="__RefHeading___Toc2664_2520221899">
             <w:r>
               <w:rPr>
                 <w:webHidden/>
@@ -1067,7 +1067,7 @@
             </w:tabs>
             <w:rPr/>
           </w:pPr>
-          <w:hyperlink w:anchor="__RefHeading___Toc2666_2309175800">
+          <w:hyperlink w:anchor="__RefHeading___Toc2666_2520221899">
             <w:r>
               <w:rPr>
                 <w:webHidden/>
@@ -1088,7 +1088,7 @@
             </w:tabs>
             <w:rPr/>
           </w:pPr>
-          <w:hyperlink w:anchor="__RefHeading___Toc2668_2309175800">
+          <w:hyperlink w:anchor="__RefHeading___Toc2668_2520221899">
             <w:r>
               <w:rPr>
                 <w:webHidden/>
@@ -1109,7 +1109,7 @@
             </w:tabs>
             <w:rPr/>
           </w:pPr>
-          <w:hyperlink w:anchor="__RefHeading___Toc2670_2309175800">
+          <w:hyperlink w:anchor="__RefHeading___Toc2670_2520221899">
             <w:r>
               <w:rPr>
                 <w:webHidden/>
@@ -1130,7 +1130,7 @@
             </w:tabs>
             <w:rPr/>
           </w:pPr>
-          <w:hyperlink w:anchor="__RefHeading___Toc2672_2309175800">
+          <w:hyperlink w:anchor="__RefHeading___Toc2672_2520221899">
             <w:r>
               <w:rPr>
                 <w:webHidden/>
@@ -1151,7 +1151,7 @@
             </w:tabs>
             <w:rPr/>
           </w:pPr>
-          <w:hyperlink w:anchor="__RefHeading___Toc2674_2309175800">
+          <w:hyperlink w:anchor="__RefHeading___Toc2674_2520221899">
             <w:r>
               <w:rPr>
                 <w:webHidden/>
@@ -1172,7 +1172,7 @@
             </w:tabs>
             <w:rPr/>
           </w:pPr>
-          <w:hyperlink w:anchor="__RefHeading___Toc2676_2309175800">
+          <w:hyperlink w:anchor="__RefHeading___Toc2676_2520221899">
             <w:r>
               <w:rPr>
                 <w:webHidden/>
@@ -1193,7 +1193,7 @@
             </w:tabs>
             <w:rPr/>
           </w:pPr>
-          <w:hyperlink w:anchor="__RefHeading___Toc2678_2309175800">
+          <w:hyperlink w:anchor="__RefHeading___Toc2678_2520221899">
             <w:r>
               <w:rPr>
                 <w:webHidden/>
@@ -1316,7 +1316,7 @@
         <w:spacing w:before="0" w:after="120"/>
         <w:rPr/>
       </w:pPr>
-      <w:bookmarkStart w:id="2" w:name="__RefHeading___Toc2576_2309175800"/>
+      <w:bookmarkStart w:id="2" w:name="__RefHeading___Toc2576_2520221899"/>
       <w:bookmarkEnd w:id="2"/>
       <w:r>
         <w:rPr>
@@ -1454,7 +1454,7 @@
         <w:spacing w:before="360" w:after="120"/>
         <w:rPr/>
       </w:pPr>
-      <w:bookmarkStart w:id="4" w:name="__RefHeading___Toc2578_2309175800"/>
+      <w:bookmarkStart w:id="4" w:name="__RefHeading___Toc2578_2520221899"/>
       <w:bookmarkStart w:id="5" w:name="X616197512f394804f2fbf1774110e6f38740946"/>
       <w:bookmarkEnd w:id="4"/>
       <w:r>
@@ -1655,7 +1655,7 @@
         <w:spacing w:before="280" w:after="80"/>
         <w:rPr/>
       </w:pPr>
-      <w:bookmarkStart w:id="6" w:name="__RefHeading___Toc2580_2309175800"/>
+      <w:bookmarkStart w:id="6" w:name="__RefHeading___Toc2580_2520221899"/>
       <w:bookmarkStart w:id="7" w:name="document-organization"/>
       <w:bookmarkEnd w:id="6"/>
       <w:r>
@@ -1703,7 +1703,7 @@
         <w:spacing w:before="200" w:after="80"/>
         <w:rPr/>
       </w:pPr>
-      <w:bookmarkStart w:id="8" w:name="__RefHeading___Toc2582_2309175800"/>
+      <w:bookmarkStart w:id="8" w:name="__RefHeading___Toc2582_2520221899"/>
       <w:bookmarkStart w:id="9" w:name="front-matter"/>
       <w:bookmarkEnd w:id="8"/>
       <w:r>
@@ -1751,7 +1751,7 @@
         <w:spacing w:before="200" w:after="80"/>
         <w:rPr/>
       </w:pPr>
-      <w:bookmarkStart w:id="11" w:name="__RefHeading___Toc2584_2309175800"/>
+      <w:bookmarkStart w:id="11" w:name="__RefHeading___Toc2584_2520221899"/>
       <w:bookmarkStart w:id="12" w:name="chapter-1-the-family-package"/>
       <w:bookmarkEnd w:id="11"/>
       <w:r>
@@ -1807,7 +1807,7 @@
         <w:spacing w:before="200" w:after="80"/>
         <w:rPr/>
       </w:pPr>
-      <w:bookmarkStart w:id="13" w:name="__RefHeading___Toc2586_2309175800"/>
+      <w:bookmarkStart w:id="13" w:name="__RefHeading___Toc2586_2520221899"/>
       <w:bookmarkStart w:id="14" w:name="Xe73b40f1192db0acd779fe60e75b80c1263b700"/>
       <w:bookmarkEnd w:id="13"/>
       <w:r>
@@ -1880,7 +1880,7 @@
         <w:spacing w:before="200" w:after="80"/>
         <w:rPr/>
       </w:pPr>
-      <w:bookmarkStart w:id="15" w:name="__RefHeading___Toc2588_2309175800"/>
+      <w:bookmarkStart w:id="15" w:name="__RefHeading___Toc2588_2520221899"/>
       <w:bookmarkStart w:id="16" w:name="Xfd03914965c1a36c753d69373597a3edba6d3ba"/>
       <w:bookmarkEnd w:id="15"/>
       <w:r>
@@ -1953,7 +1953,7 @@
         <w:spacing w:before="200" w:after="80"/>
         <w:rPr/>
       </w:pPr>
-      <w:bookmarkStart w:id="17" w:name="__RefHeading___Toc2590_2309175800"/>
+      <w:bookmarkStart w:id="17" w:name="__RefHeading___Toc2590_2520221899"/>
       <w:bookmarkStart w:id="18" w:name="Xae2fb05cfd41b92d952510e81a7f289f9208afe"/>
       <w:bookmarkEnd w:id="17"/>
       <w:r>
@@ -2026,7 +2026,7 @@
         <w:spacing w:before="200" w:after="80"/>
         <w:rPr/>
       </w:pPr>
-      <w:bookmarkStart w:id="19" w:name="__RefHeading___Toc2592_2309175800"/>
+      <w:bookmarkStart w:id="19" w:name="__RefHeading___Toc2592_2520221899"/>
       <w:bookmarkStart w:id="20" w:name="chapter-5-mc_training_layer"/>
       <w:bookmarkEnd w:id="19"/>
       <w:r>
@@ -2091,7 +2091,7 @@
         <w:spacing w:before="200" w:after="80"/>
         <w:rPr/>
       </w:pPr>
-      <w:bookmarkStart w:id="21" w:name="__RefHeading___Toc2594_2309175800"/>
+      <w:bookmarkStart w:id="21" w:name="__RefHeading___Toc2594_2520221899"/>
       <w:bookmarkStart w:id="22" w:name="chapter-6-mc_ras_layer"/>
       <w:bookmarkEnd w:id="21"/>
       <w:r>
@@ -2156,7 +2156,7 @@
         <w:spacing w:before="200" w:after="80"/>
         <w:rPr/>
       </w:pPr>
-      <w:bookmarkStart w:id="23" w:name="__RefHeading___Toc2596_2309175800"/>
+      <w:bookmarkStart w:id="23" w:name="__RefHeading___Toc2596_2520221899"/>
       <w:bookmarkStart w:id="24" w:name="X6b7ef090e93368a3c74775085b7d22e8fdb9bc1"/>
       <w:bookmarkEnd w:id="23"/>
       <w:r>
@@ -2229,7 +2229,7 @@
         <w:spacing w:before="200" w:after="80"/>
         <w:rPr/>
       </w:pPr>
-      <w:bookmarkStart w:id="25" w:name="__RefHeading___Toc2598_2309175800"/>
+      <w:bookmarkStart w:id="25" w:name="__RefHeading___Toc2598_2520221899"/>
       <w:bookmarkStart w:id="26" w:name="chapter-8-mc_dfi_3p1_layer"/>
       <w:bookmarkEnd w:id="25"/>
       <w:r>
@@ -2294,7 +2294,7 @@
         <w:spacing w:before="200" w:after="80"/>
         <w:rPr/>
       </w:pPr>
-      <w:bookmarkStart w:id="27" w:name="__RefHeading___Toc2600_2309175800"/>
+      <w:bookmarkStart w:id="27" w:name="__RefHeading___Toc2600_2520221899"/>
       <w:bookmarkStart w:id="28" w:name="chapter-9-mc_dfi_4p0_layer"/>
       <w:bookmarkEnd w:id="27"/>
       <w:r>
@@ -2453,7 +2453,7 @@
         <w:spacing w:before="360" w:after="120"/>
         <w:rPr/>
       </w:pPr>
-      <w:bookmarkStart w:id="32" w:name="__RefHeading___Toc2602_2309175800"/>
+      <w:bookmarkStart w:id="32" w:name="__RefHeading___Toc2602_2520221899"/>
       <w:bookmarkStart w:id="33" w:name="document-information"/>
       <w:bookmarkEnd w:id="32"/>
       <w:r>
@@ -3036,7 +3036,7 @@
         <w:spacing w:before="280" w:after="80"/>
         <w:rPr/>
       </w:pPr>
-      <w:bookmarkStart w:id="34" w:name="__RefHeading___Toc2604_2309175800"/>
+      <w:bookmarkStart w:id="34" w:name="__RefHeading___Toc2604_2520221899"/>
       <w:bookmarkEnd w:id="34"/>
       <w:r>
         <w:rPr>
@@ -3319,7 +3319,7 @@
         <w:spacing w:before="280" w:after="80"/>
         <w:rPr/>
       </w:pPr>
-      <w:bookmarkStart w:id="35" w:name="__RefHeading___Toc2606_2309175800"/>
+      <w:bookmarkStart w:id="35" w:name="__RefHeading___Toc2606_2520221899"/>
       <w:bookmarkEnd w:id="35"/>
       <w:r>
         <w:rPr>
@@ -3871,7 +3871,7 @@
         <w:spacing w:before="360" w:after="120"/>
         <w:rPr/>
       </w:pPr>
-      <w:bookmarkStart w:id="37" w:name="__RefHeading___Toc2608_2309175800"/>
+      <w:bookmarkStart w:id="37" w:name="__RefHeading___Toc2608_2520221899"/>
       <w:bookmarkStart w:id="38" w:name="purpose-scope-and-the-two-lines"/>
       <w:bookmarkEnd w:id="37"/>
       <w:r>
@@ -3902,7 +3902,7 @@
         <w:spacing w:before="280" w:after="80"/>
         <w:rPr/>
       </w:pPr>
-      <w:bookmarkStart w:id="39" w:name="__RefHeading___Toc2610_2309175800"/>
+      <w:bookmarkStart w:id="39" w:name="__RefHeading___Toc2610_2520221899"/>
       <w:bookmarkStart w:id="40" w:name="purpose"/>
       <w:bookmarkEnd w:id="39"/>
       <w:r>
@@ -4056,7 +4056,7 @@
         <w:spacing w:before="280" w:after="80"/>
         <w:rPr/>
       </w:pPr>
-      <w:bookmarkStart w:id="41" w:name="__RefHeading___Toc2612_2309175800"/>
+      <w:bookmarkStart w:id="41" w:name="__RefHeading___Toc2612_2520221899"/>
       <w:bookmarkStart w:id="42" w:name="X02b33bbc1801cd189339d45a688fcaae9520a66"/>
       <w:bookmarkEnd w:id="41"/>
       <w:r>
@@ -4139,7 +4139,7 @@
         <w:spacing w:before="280" w:after="80"/>
         <w:rPr/>
       </w:pPr>
-      <w:bookmarkStart w:id="43" w:name="__RefHeading___Toc2614_2309175800"/>
+      <w:bookmarkStart w:id="43" w:name="__RefHeading___Toc2614_2520221899"/>
       <w:bookmarkStart w:id="44" w:name="the-two-lines-research-and-product"/>
       <w:bookmarkEnd w:id="43"/>
       <w:r>
@@ -4251,7 +4251,7 @@
         <w:spacing w:before="280" w:after="80"/>
         <w:rPr/>
       </w:pPr>
-      <w:bookmarkStart w:id="45" w:name="__RefHeading___Toc2616_2309175800"/>
+      <w:bookmarkStart w:id="45" w:name="__RefHeading___Toc2616_2520221899"/>
       <w:bookmarkStart w:id="46" w:name="what-this-book-binds"/>
       <w:bookmarkEnd w:id="45"/>
       <w:r>
@@ -4396,7 +4396,7 @@
         <w:spacing w:before="280" w:after="80"/>
         <w:rPr/>
       </w:pPr>
-      <w:bookmarkStart w:id="48" w:name="__RefHeading___Toc2618_2309175800"/>
+      <w:bookmarkStart w:id="48" w:name="__RefHeading___Toc2618_2520221899"/>
       <w:bookmarkStart w:id="49" w:name="conventions"/>
       <w:bookmarkEnd w:id="48"/>
       <w:r>
@@ -4529,7 +4529,7 @@
         <w:spacing w:before="360" w:after="120"/>
         <w:rPr/>
       </w:pPr>
-      <w:bookmarkStart w:id="52" w:name="__RefHeading___Toc2620_2309175800"/>
+      <w:bookmarkStart w:id="52" w:name="__RefHeading___Toc2620_2520221899"/>
       <w:bookmarkStart w:id="53" w:name="X35fb09d53ce58ee1df67816bcaac5b674efa180"/>
       <w:bookmarkEnd w:id="52"/>
       <w:r>
@@ -4586,7 +4586,7 @@
         <w:rPr/>
         <w:drawing>
           <wp:inline distT="0" distB="0" distL="0" distR="0">
-            <wp:extent cx="5334000" cy="2839720"/>
+            <wp:extent cx="5334000" cy="2749550"/>
             <wp:effectExtent l="0" t="0" r="0" b="0"/>
             <wp:docPr id="11" name="Picture" descr="The mem-ctrl-ip whole unit — AXI channels at top, the layer stack in the middle, DDR PHY bar at the bottom"/>
             <wp:cNvGraphicFramePr>
@@ -4610,7 +4610,7 @@
                   <pic:spPr bwMode="auto">
                     <a:xfrm>
                       <a:off x="0" y="0"/>
-                      <a:ext cx="5334000" cy="2839720"/>
+                      <a:ext cx="5334000" cy="2749550"/>
                     </a:xfrm>
                     <a:prstGeom prst="rect">
                       <a:avLst/>
@@ -4642,7 +4642,7 @@
         <w:spacing w:before="280" w:after="80"/>
         <w:rPr/>
       </w:pPr>
-      <w:bookmarkStart w:id="54" w:name="__RefHeading___Toc2622_2309175800"/>
+      <w:bookmarkStart w:id="54" w:name="__RefHeading___Toc2622_2520221899"/>
       <w:bookmarkEnd w:id="54"/>
       <w:r>
         <w:rPr>
@@ -5737,7 +5737,7 @@
         <w:spacing w:before="280" w:after="80"/>
         <w:rPr/>
       </w:pPr>
-      <w:bookmarkStart w:id="56" w:name="__RefHeading___Toc2624_2309175800"/>
+      <w:bookmarkStart w:id="56" w:name="__RefHeading___Toc2624_2520221899"/>
       <w:bookmarkEnd w:id="56"/>
       <w:r>
         <w:rPr>
@@ -5833,7 +5833,7 @@
         <w:spacing w:before="280" w:after="80"/>
         <w:rPr/>
       </w:pPr>
-      <w:bookmarkStart w:id="57" w:name="__RefHeading___Toc2626_2309175800"/>
+      <w:bookmarkStart w:id="57" w:name="__RefHeading___Toc2626_2520221899"/>
       <w:bookmarkStart w:id="58" w:name="the-three-structural-rules-of-the-stack"/>
       <w:bookmarkEnd w:id="57"/>
       <w:r>
@@ -5939,7 +5939,7 @@
         <w:spacing w:before="280" w:after="80"/>
         <w:rPr/>
       </w:pPr>
-      <w:bookmarkStart w:id="59" w:name="__RefHeading___Toc2628_2309175800"/>
+      <w:bookmarkStart w:id="59" w:name="__RefHeading___Toc2628_2520221899"/>
       <w:bookmarkStart w:id="60" w:name="what-the-rocks-own"/>
       <w:bookmarkEnd w:id="59"/>
       <w:r>
@@ -6086,7 +6086,7 @@
         <w:spacing w:before="360" w:after="120"/>
         <w:rPr/>
       </w:pPr>
-      <w:bookmarkStart w:id="63" w:name="__RefHeading___Toc2630_2309175800"/>
+      <w:bookmarkStart w:id="63" w:name="__RefHeading___Toc2630_2520221899"/>
       <w:bookmarkStart w:id="64" w:name="the-descriptor-seam"/>
       <w:bookmarkEnd w:id="63"/>
       <w:r>
@@ -6143,7 +6143,7 @@
         <w:spacing w:before="280" w:after="80"/>
         <w:rPr/>
       </w:pPr>
-      <w:bookmarkStart w:id="65" w:name="__RefHeading___Toc2632_2309175800"/>
+      <w:bookmarkStart w:id="65" w:name="__RefHeading___Toc2632_2520221899"/>
       <w:bookmarkStart w:id="66" w:name="the-contract"/>
       <w:bookmarkEnd w:id="65"/>
       <w:r>
@@ -6283,7 +6283,7 @@
         <w:spacing w:before="280" w:after="80"/>
         <w:rPr/>
       </w:pPr>
-      <w:bookmarkStart w:id="68" w:name="__RefHeading___Toc2634_2309175800"/>
+      <w:bookmarkStart w:id="68" w:name="__RefHeading___Toc2634_2520221899"/>
       <w:bookmarkStart w:id="69" w:name="the-invariants"/>
       <w:bookmarkEnd w:id="68"/>
       <w:r>
@@ -6390,7 +6390,7 @@
         <w:spacing w:before="280" w:after="80"/>
         <w:rPr/>
       </w:pPr>
-      <w:bookmarkStart w:id="70" w:name="__RefHeading___Toc2636_2309175800"/>
+      <w:bookmarkStart w:id="70" w:name="__RefHeading___Toc2636_2520221899"/>
       <w:bookmarkStart w:id="71" w:name="what-the-seam-is-not"/>
       <w:bookmarkEnd w:id="70"/>
       <w:r>
@@ -6517,7 +6517,7 @@
         <w:spacing w:before="280" w:after="80"/>
         <w:rPr/>
       </w:pPr>
-      <w:bookmarkStart w:id="72" w:name="__RefHeading___Toc2638_2309175800"/>
+      <w:bookmarkStart w:id="72" w:name="__RefHeading___Toc2638_2520221899"/>
       <w:bookmarkStart w:id="73" w:name="where-this-stands-in-the-rocks"/>
       <w:bookmarkEnd w:id="72"/>
       <w:r>
@@ -6663,7 +6663,7 @@
         <w:spacing w:before="360" w:after="120"/>
         <w:rPr/>
       </w:pPr>
-      <w:bookmarkStart w:id="76" w:name="__RefHeading___Toc2640_2309175800"/>
+      <w:bookmarkStart w:id="76" w:name="__RefHeading___Toc2640_2520221899"/>
       <w:bookmarkStart w:id="77" w:name="Xba0e68e539aa7351d2f5c03a115f460d02e06c0"/>
       <w:bookmarkEnd w:id="76"/>
       <w:r>
@@ -6810,7 +6810,7 @@
         <w:spacing w:before="280" w:after="80"/>
         <w:rPr/>
       </w:pPr>
-      <w:bookmarkStart w:id="78" w:name="__RefHeading___Toc2642_2309175800"/>
+      <w:bookmarkStart w:id="78" w:name="__RefHeading___Toc2642_2520221899"/>
       <w:bookmarkStart w:id="79" w:name="the-reasoning"/>
       <w:bookmarkEnd w:id="78"/>
       <w:r>
@@ -6919,7 +6919,7 @@
         <w:spacing w:before="280" w:after="80"/>
         <w:rPr/>
       </w:pPr>
-      <w:bookmarkStart w:id="80" w:name="__RefHeading___Toc2644_2309175800"/>
+      <w:bookmarkStart w:id="80" w:name="__RefHeading___Toc2644_2520221899"/>
       <w:bookmarkStart w:id="81" w:name="what-is-shared"/>
       <w:bookmarkEnd w:id="80"/>
       <w:r>
@@ -7452,7 +7452,7 @@
         <w:spacing w:before="280" w:after="80"/>
         <w:rPr/>
       </w:pPr>
-      <w:bookmarkStart w:id="82" w:name="__RefHeading___Toc2646_2309175800"/>
+      <w:bookmarkStart w:id="82" w:name="__RefHeading___Toc2646_2520221899"/>
       <w:bookmarkStart w:id="83" w:name="what-the-layer-never-does"/>
       <w:bookmarkEnd w:id="82"/>
       <w:r>
@@ -7613,7 +7613,7 @@
         <w:spacing w:before="360" w:after="120"/>
         <w:rPr/>
       </w:pPr>
-      <w:bookmarkStart w:id="86" w:name="__RefHeading___Toc2648_2309175800"/>
+      <w:bookmarkStart w:id="86" w:name="__RefHeading___Toc2648_2520221899"/>
       <w:bookmarkStart w:id="87" w:name="Xc26196f7674c66983726de17c545c6649bb3fab"/>
       <w:bookmarkEnd w:id="86"/>
       <w:r>
@@ -7670,7 +7670,7 @@
         <w:spacing w:before="280" w:after="80"/>
         <w:rPr/>
       </w:pPr>
-      <w:bookmarkStart w:id="88" w:name="__RefHeading___Toc2650_2309175800"/>
+      <w:bookmarkStart w:id="88" w:name="__RefHeading___Toc2650_2520221899"/>
       <w:bookmarkStart w:id="89" w:name="X8fa9d289b34687b6fa07df052b670cb17558661"/>
       <w:bookmarkEnd w:id="88"/>
       <w:r>
@@ -7747,7 +7747,7 @@
         <w:spacing w:before="280" w:after="80"/>
         <w:rPr/>
       </w:pPr>
-      <w:bookmarkStart w:id="90" w:name="__RefHeading___Toc2652_2309175800"/>
+      <w:bookmarkStart w:id="90" w:name="__RefHeading___Toc2652_2520221899"/>
       <w:bookmarkStart w:id="91" w:name="parameterize-width-never-personality"/>
       <w:bookmarkEnd w:id="90"/>
       <w:r>
@@ -7851,7 +7851,7 @@
         <w:spacing w:before="280" w:after="80"/>
         <w:rPr/>
       </w:pPr>
-      <w:bookmarkStart w:id="92" w:name="__RefHeading___Toc2654_2309175800"/>
+      <w:bookmarkStart w:id="92" w:name="__RefHeading___Toc2654_2520221899"/>
       <w:bookmarkStart w:id="93" w:name="X7c6b25d78360fe2e4fe81e68e87c32fcf8cda69"/>
       <w:bookmarkEnd w:id="92"/>
       <w:r>
@@ -7915,7 +7915,7 @@
         <w:spacing w:before="280" w:after="80"/>
         <w:rPr/>
       </w:pPr>
-      <w:bookmarkStart w:id="94" w:name="__RefHeading___Toc2656_2309175800"/>
+      <w:bookmarkStart w:id="94" w:name="__RefHeading___Toc2656_2520221899"/>
       <w:bookmarkStart w:id="95" w:name="X416b554ca19ee0550a4692b0d160f4e163ab46b"/>
       <w:bookmarkEnd w:id="94"/>
       <w:r>
@@ -8019,7 +8019,7 @@
         <w:spacing w:before="280" w:after="80"/>
         <w:rPr/>
       </w:pPr>
-      <w:bookmarkStart w:id="96" w:name="__RefHeading___Toc2658_2309175800"/>
+      <w:bookmarkStart w:id="96" w:name="__RefHeading___Toc2658_2520221899"/>
       <w:bookmarkStart w:id="97" w:name="X4e83b81ceef783af7b63185336af6225b7314d3"/>
       <w:bookmarkEnd w:id="96"/>
       <w:r>
@@ -8096,7 +8096,7 @@
         <w:spacing w:before="280" w:after="80"/>
         <w:rPr/>
       </w:pPr>
-      <w:bookmarkStart w:id="98" w:name="__RefHeading___Toc2660_2309175800"/>
+      <w:bookmarkStart w:id="98" w:name="__RefHeading___Toc2660_2520221899"/>
       <w:bookmarkStart w:id="99" w:name="Xb3a20a7d499f0a0ca4e9f419fb6dadc4bc8a470"/>
       <w:bookmarkEnd w:id="98"/>
       <w:r>
@@ -8249,7 +8249,7 @@
         <w:spacing w:before="360" w:after="120"/>
         <w:rPr/>
       </w:pPr>
-      <w:bookmarkStart w:id="102" w:name="__RefHeading___Toc2662_2309175800"/>
+      <w:bookmarkStart w:id="102" w:name="__RefHeading___Toc2662_2520221899"/>
       <w:bookmarkStart w:id="103" w:name="the-common-ip-layout"/>
       <w:bookmarkEnd w:id="102"/>
       <w:r>
@@ -8394,7 +8394,7 @@
         <w:spacing w:before="280" w:after="80"/>
         <w:rPr/>
       </w:pPr>
-      <w:bookmarkStart w:id="104" w:name="__RefHeading___Toc2664_2309175800"/>
+      <w:bookmarkStart w:id="104" w:name="__RefHeading___Toc2664_2520221899"/>
       <w:bookmarkStart w:id="105" w:name="the-blocks-as-of-2026-10-10"/>
       <w:bookmarkEnd w:id="104"/>
       <w:r>
@@ -9670,7 +9670,7 @@
         <w:spacing w:before="280" w:after="80"/>
         <w:rPr/>
       </w:pPr>
-      <w:bookmarkStart w:id="106" w:name="__RefHeading___Toc2666_2309175800"/>
+      <w:bookmarkStart w:id="106" w:name="__RefHeading___Toc2666_2520221899"/>
       <w:bookmarkStart w:id="107" w:name="X2611791d1bdfcecec1bf22dcc222e0c21c9b431"/>
       <w:bookmarkEnd w:id="106"/>
       <w:r>
@@ -9715,7 +9715,7 @@
         <w:spacing w:before="280" w:after="80"/>
         <w:rPr/>
       </w:pPr>
-      <w:bookmarkStart w:id="109" w:name="__RefHeading___Toc2668_2309175800"/>
+      <w:bookmarkStart w:id="109" w:name="__RefHeading___Toc2668_2520221899"/>
       <w:bookmarkStart w:id="110" w:name="documentation-map"/>
       <w:bookmarkEnd w:id="109"/>
       <w:r>
@@ -10491,7 +10491,7 @@
         <w:spacing w:before="360" w:after="120"/>
         <w:rPr/>
       </w:pPr>
-      <w:bookmarkStart w:id="113" w:name="__RefHeading___Toc2670_2309175800"/>
+      <w:bookmarkStart w:id="113" w:name="__RefHeading___Toc2670_2520221899"/>
       <w:bookmarkStart w:id="114" w:name="Xec01d7fcc00e62d53b5638288c846d5a89df379"/>
       <w:bookmarkEnd w:id="113"/>
       <w:r>
@@ -10534,7 +10534,7 @@
         <w:spacing w:before="280" w:after="80"/>
         <w:rPr/>
       </w:pPr>
-      <w:bookmarkStart w:id="115" w:name="__RefHeading___Toc2672_2309175800"/>
+      <w:bookmarkStart w:id="115" w:name="__RefHeading___Toc2672_2520221899"/>
       <w:bookmarkStart w:id="116" w:name="the-product-names"/>
       <w:bookmarkEnd w:id="115"/>
       <w:r>
@@ -11137,7 +11137,7 @@
         <w:spacing w:before="280" w:after="80"/>
         <w:rPr/>
       </w:pPr>
-      <w:bookmarkStart w:id="118" w:name="__RefHeading___Toc2674_2309175800"/>
+      <w:bookmarkStart w:id="118" w:name="__RefHeading___Toc2674_2520221899"/>
       <w:bookmarkStart w:id="119" w:name="Xa16f4717d14061f81a0dc9a449617a75cce903a"/>
       <w:bookmarkEnd w:id="118"/>
       <w:r>
@@ -11296,7 +11296,7 @@
         <w:spacing w:before="280" w:after="80"/>
         <w:rPr/>
       </w:pPr>
-      <w:bookmarkStart w:id="120" w:name="__RefHeading___Toc2676_2309175800"/>
+      <w:bookmarkStart w:id="120" w:name="__RefHeading___Toc2676_2520221899"/>
       <w:bookmarkStart w:id="121" w:name="the-research-lines-role"/>
       <w:bookmarkEnd w:id="120"/>
       <w:r>
@@ -11341,7 +11341,7 @@
         <w:spacing w:before="280" w:after="80"/>
         <w:rPr/>
       </w:pPr>
-      <w:bookmarkStart w:id="123" w:name="__RefHeading___Toc2678_2309175800"/>
+      <w:bookmarkStart w:id="123" w:name="__RefHeading___Toc2678_2520221899"/>
       <w:bookmarkStart w:id="124" w:name="relationship-to-the-rocks-books"/>
       <w:bookmarkEnd w:id="123"/>
       <w:r>

</xml_diff>

<commit_message>
docs(mem-ctrl): whole-unit - wider/taller DFI boxes, straight wr/rd paths, xlabel fix
Owner feedback on the family HAS diagram:
- Write/Read Data Path Control boxes are now wider and 2x taller, so the
  write data (merge/forward buffers) and read return paths run as straight
  lines into them instead of bunching under the scheduler trapezium; the
  DDR Command drop runs clean down the center between them
- 'timer window' label fixed: as a plain label on a same-rank edge it was
  drawn at the edge midpoint and overdrawn by the trapezium fill (invisible
  in every render since it was added); now an xlabel, visible beside the
  arrow
- STYLE.md: same-rank edge labels need xlabel (codified with the example)

Verified at full resolution after rendering; family HAS PDF regenerated.
</commit_message>
<xml_diff>
--- a/projects/components/mem-ctrl-ip/common-ip/docs/mem_ctrl_ip_family_HAS_v0.1.docx
+++ b/projects/components/mem-ctrl-ip/common-ip/docs/mem_ctrl_ip_family_HAS_v0.1.docx
@@ -122,7 +122,7 @@
             </w:rPr>
             <w:fldChar w:fldCharType="separate"/>
           </w:r>
-          <w:hyperlink w:anchor="__RefHeading___Toc2576_2520221899">
+          <w:hyperlink w:anchor="__RefHeading___Toc2576_875856940">
             <w:r>
               <w:rPr>
                 <w:webHidden/>
@@ -143,7 +143,7 @@
             </w:tabs>
             <w:rPr/>
           </w:pPr>
-          <w:hyperlink w:anchor="__RefHeading___Toc2578_2520221899">
+          <w:hyperlink w:anchor="__RefHeading___Toc2578_875856940">
             <w:r>
               <w:rPr>
                 <w:webHidden/>
@@ -164,7 +164,7 @@
             </w:tabs>
             <w:rPr/>
           </w:pPr>
-          <w:hyperlink w:anchor="__RefHeading___Toc2580_2520221899">
+          <w:hyperlink w:anchor="__RefHeading___Toc2580_875856940">
             <w:r>
               <w:rPr>
                 <w:webHidden/>
@@ -185,7 +185,7 @@
             </w:tabs>
             <w:rPr/>
           </w:pPr>
-          <w:hyperlink w:anchor="__RefHeading___Toc2582_2520221899">
+          <w:hyperlink w:anchor="__RefHeading___Toc2582_875856940">
             <w:r>
               <w:rPr>
                 <w:webHidden/>
@@ -206,7 +206,7 @@
             </w:tabs>
             <w:rPr/>
           </w:pPr>
-          <w:hyperlink w:anchor="__RefHeading___Toc2584_2520221899">
+          <w:hyperlink w:anchor="__RefHeading___Toc2584_875856940">
             <w:r>
               <w:rPr>
                 <w:webHidden/>
@@ -227,7 +227,7 @@
             </w:tabs>
             <w:rPr/>
           </w:pPr>
-          <w:hyperlink w:anchor="__RefHeading___Toc2586_2520221899">
+          <w:hyperlink w:anchor="__RefHeading___Toc2586_875856940">
             <w:r>
               <w:rPr>
                 <w:webHidden/>
@@ -248,7 +248,7 @@
             </w:tabs>
             <w:rPr/>
           </w:pPr>
-          <w:hyperlink w:anchor="__RefHeading___Toc2588_2520221899">
+          <w:hyperlink w:anchor="__RefHeading___Toc2588_875856940">
             <w:r>
               <w:rPr>
                 <w:webHidden/>
@@ -269,7 +269,7 @@
             </w:tabs>
             <w:rPr/>
           </w:pPr>
-          <w:hyperlink w:anchor="__RefHeading___Toc2590_2520221899">
+          <w:hyperlink w:anchor="__RefHeading___Toc2590_875856940">
             <w:r>
               <w:rPr>
                 <w:webHidden/>
@@ -290,7 +290,7 @@
             </w:tabs>
             <w:rPr/>
           </w:pPr>
-          <w:hyperlink w:anchor="__RefHeading___Toc2592_2520221899">
+          <w:hyperlink w:anchor="__RefHeading___Toc2592_875856940">
             <w:r>
               <w:rPr>
                 <w:webHidden/>
@@ -311,7 +311,7 @@
             </w:tabs>
             <w:rPr/>
           </w:pPr>
-          <w:hyperlink w:anchor="__RefHeading___Toc2594_2520221899">
+          <w:hyperlink w:anchor="__RefHeading___Toc2594_875856940">
             <w:r>
               <w:rPr>
                 <w:webHidden/>
@@ -332,7 +332,7 @@
             </w:tabs>
             <w:rPr/>
           </w:pPr>
-          <w:hyperlink w:anchor="__RefHeading___Toc2596_2520221899">
+          <w:hyperlink w:anchor="__RefHeading___Toc2596_875856940">
             <w:r>
               <w:rPr>
                 <w:webHidden/>
@@ -353,7 +353,7 @@
             </w:tabs>
             <w:rPr/>
           </w:pPr>
-          <w:hyperlink w:anchor="__RefHeading___Toc2598_2520221899">
+          <w:hyperlink w:anchor="__RefHeading___Toc2598_875856940">
             <w:r>
               <w:rPr>
                 <w:webHidden/>
@@ -374,7 +374,7 @@
             </w:tabs>
             <w:rPr/>
           </w:pPr>
-          <w:hyperlink w:anchor="__RefHeading___Toc2600_2520221899">
+          <w:hyperlink w:anchor="__RefHeading___Toc2600_875856940">
             <w:r>
               <w:rPr>
                 <w:webHidden/>
@@ -395,7 +395,7 @@
             </w:tabs>
             <w:rPr/>
           </w:pPr>
-          <w:hyperlink w:anchor="__RefHeading___Toc2602_2520221899">
+          <w:hyperlink w:anchor="__RefHeading___Toc2602_875856940">
             <w:r>
               <w:rPr>
                 <w:webHidden/>
@@ -416,7 +416,7 @@
             </w:tabs>
             <w:rPr/>
           </w:pPr>
-          <w:hyperlink w:anchor="__RefHeading___Toc2604_2520221899">
+          <w:hyperlink w:anchor="__RefHeading___Toc2604_875856940">
             <w:r>
               <w:rPr>
                 <w:webHidden/>
@@ -437,7 +437,7 @@
             </w:tabs>
             <w:rPr/>
           </w:pPr>
-          <w:hyperlink w:anchor="__RefHeading___Toc2606_2520221899">
+          <w:hyperlink w:anchor="__RefHeading___Toc2606_875856940">
             <w:r>
               <w:rPr>
                 <w:webHidden/>
@@ -458,7 +458,7 @@
             </w:tabs>
             <w:rPr/>
           </w:pPr>
-          <w:hyperlink w:anchor="__RefHeading___Toc2608_2520221899">
+          <w:hyperlink w:anchor="__RefHeading___Toc2608_875856940">
             <w:r>
               <w:rPr>
                 <w:webHidden/>
@@ -479,7 +479,7 @@
             </w:tabs>
             <w:rPr/>
           </w:pPr>
-          <w:hyperlink w:anchor="__RefHeading___Toc2610_2520221899">
+          <w:hyperlink w:anchor="__RefHeading___Toc2610_875856940">
             <w:r>
               <w:rPr>
                 <w:webHidden/>
@@ -500,7 +500,7 @@
             </w:tabs>
             <w:rPr/>
           </w:pPr>
-          <w:hyperlink w:anchor="__RefHeading___Toc2612_2520221899">
+          <w:hyperlink w:anchor="__RefHeading___Toc2612_875856940">
             <w:r>
               <w:rPr>
                 <w:webHidden/>
@@ -521,7 +521,7 @@
             </w:tabs>
             <w:rPr/>
           </w:pPr>
-          <w:hyperlink w:anchor="__RefHeading___Toc2614_2520221899">
+          <w:hyperlink w:anchor="__RefHeading___Toc2614_875856940">
             <w:r>
               <w:rPr>
                 <w:webHidden/>
@@ -542,7 +542,7 @@
             </w:tabs>
             <w:rPr/>
           </w:pPr>
-          <w:hyperlink w:anchor="__RefHeading___Toc2616_2520221899">
+          <w:hyperlink w:anchor="__RefHeading___Toc2616_875856940">
             <w:r>
               <w:rPr>
                 <w:webHidden/>
@@ -563,7 +563,7 @@
             </w:tabs>
             <w:rPr/>
           </w:pPr>
-          <w:hyperlink w:anchor="__RefHeading___Toc2618_2520221899">
+          <w:hyperlink w:anchor="__RefHeading___Toc2618_875856940">
             <w:r>
               <w:rPr>
                 <w:webHidden/>
@@ -584,7 +584,7 @@
             </w:tabs>
             <w:rPr/>
           </w:pPr>
-          <w:hyperlink w:anchor="__RefHeading___Toc2620_2520221899">
+          <w:hyperlink w:anchor="__RefHeading___Toc2620_875856940">
             <w:r>
               <w:rPr>
                 <w:webHidden/>
@@ -605,7 +605,7 @@
             </w:tabs>
             <w:rPr/>
           </w:pPr>
-          <w:hyperlink w:anchor="__RefHeading___Toc2622_2520221899">
+          <w:hyperlink w:anchor="__RefHeading___Toc2622_875856940">
             <w:r>
               <w:rPr>
                 <w:webHidden/>
@@ -626,7 +626,7 @@
             </w:tabs>
             <w:rPr/>
           </w:pPr>
-          <w:hyperlink w:anchor="__RefHeading___Toc2624_2520221899">
+          <w:hyperlink w:anchor="__RefHeading___Toc2624_875856940">
             <w:r>
               <w:rPr>
                 <w:webHidden/>
@@ -647,7 +647,7 @@
             </w:tabs>
             <w:rPr/>
           </w:pPr>
-          <w:hyperlink w:anchor="__RefHeading___Toc2626_2520221899">
+          <w:hyperlink w:anchor="__RefHeading___Toc2626_875856940">
             <w:r>
               <w:rPr>
                 <w:webHidden/>
@@ -668,7 +668,7 @@
             </w:tabs>
             <w:rPr/>
           </w:pPr>
-          <w:hyperlink w:anchor="__RefHeading___Toc2628_2520221899">
+          <w:hyperlink w:anchor="__RefHeading___Toc2628_875856940">
             <w:r>
               <w:rPr>
                 <w:webHidden/>
@@ -689,7 +689,7 @@
             </w:tabs>
             <w:rPr/>
           </w:pPr>
-          <w:hyperlink w:anchor="__RefHeading___Toc2630_2520221899">
+          <w:hyperlink w:anchor="__RefHeading___Toc2630_875856940">
             <w:r>
               <w:rPr>
                 <w:webHidden/>
@@ -710,7 +710,7 @@
             </w:tabs>
             <w:rPr/>
           </w:pPr>
-          <w:hyperlink w:anchor="__RefHeading___Toc2632_2520221899">
+          <w:hyperlink w:anchor="__RefHeading___Toc2632_875856940">
             <w:r>
               <w:rPr>
                 <w:webHidden/>
@@ -731,7 +731,7 @@
             </w:tabs>
             <w:rPr/>
           </w:pPr>
-          <w:hyperlink w:anchor="__RefHeading___Toc2634_2520221899">
+          <w:hyperlink w:anchor="__RefHeading___Toc2634_875856940">
             <w:r>
               <w:rPr>
                 <w:webHidden/>
@@ -752,7 +752,7 @@
             </w:tabs>
             <w:rPr/>
           </w:pPr>
-          <w:hyperlink w:anchor="__RefHeading___Toc2636_2520221899">
+          <w:hyperlink w:anchor="__RefHeading___Toc2636_875856940">
             <w:r>
               <w:rPr>
                 <w:webHidden/>
@@ -773,7 +773,7 @@
             </w:tabs>
             <w:rPr/>
           </w:pPr>
-          <w:hyperlink w:anchor="__RefHeading___Toc2638_2520221899">
+          <w:hyperlink w:anchor="__RefHeading___Toc2638_875856940">
             <w:r>
               <w:rPr>
                 <w:webHidden/>
@@ -794,7 +794,7 @@
             </w:tabs>
             <w:rPr/>
           </w:pPr>
-          <w:hyperlink w:anchor="__RefHeading___Toc2640_2520221899">
+          <w:hyperlink w:anchor="__RefHeading___Toc2640_875856940">
             <w:r>
               <w:rPr>
                 <w:webHidden/>
@@ -815,7 +815,7 @@
             </w:tabs>
             <w:rPr/>
           </w:pPr>
-          <w:hyperlink w:anchor="__RefHeading___Toc2642_2520221899">
+          <w:hyperlink w:anchor="__RefHeading___Toc2642_875856940">
             <w:r>
               <w:rPr>
                 <w:webHidden/>
@@ -836,7 +836,7 @@
             </w:tabs>
             <w:rPr/>
           </w:pPr>
-          <w:hyperlink w:anchor="__RefHeading___Toc2644_2520221899">
+          <w:hyperlink w:anchor="__RefHeading___Toc2644_875856940">
             <w:r>
               <w:rPr>
                 <w:webHidden/>
@@ -857,7 +857,7 @@
             </w:tabs>
             <w:rPr/>
           </w:pPr>
-          <w:hyperlink w:anchor="__RefHeading___Toc2646_2520221899">
+          <w:hyperlink w:anchor="__RefHeading___Toc2646_875856940">
             <w:r>
               <w:rPr>
                 <w:webHidden/>
@@ -878,7 +878,7 @@
             </w:tabs>
             <w:rPr/>
           </w:pPr>
-          <w:hyperlink w:anchor="__RefHeading___Toc2648_2520221899">
+          <w:hyperlink w:anchor="__RefHeading___Toc2648_875856940">
             <w:r>
               <w:rPr>
                 <w:webHidden/>
@@ -899,7 +899,7 @@
             </w:tabs>
             <w:rPr/>
           </w:pPr>
-          <w:hyperlink w:anchor="__RefHeading___Toc2650_2520221899">
+          <w:hyperlink w:anchor="__RefHeading___Toc2650_875856940">
             <w:r>
               <w:rPr>
                 <w:webHidden/>
@@ -920,7 +920,7 @@
             </w:tabs>
             <w:rPr/>
           </w:pPr>
-          <w:hyperlink w:anchor="__RefHeading___Toc2652_2520221899">
+          <w:hyperlink w:anchor="__RefHeading___Toc2652_875856940">
             <w:r>
               <w:rPr>
                 <w:webHidden/>
@@ -941,7 +941,7 @@
             </w:tabs>
             <w:rPr/>
           </w:pPr>
-          <w:hyperlink w:anchor="__RefHeading___Toc2654_2520221899">
+          <w:hyperlink w:anchor="__RefHeading___Toc2654_875856940">
             <w:r>
               <w:rPr>
                 <w:webHidden/>
@@ -962,7 +962,7 @@
             </w:tabs>
             <w:rPr/>
           </w:pPr>
-          <w:hyperlink w:anchor="__RefHeading___Toc2656_2520221899">
+          <w:hyperlink w:anchor="__RefHeading___Toc2656_875856940">
             <w:r>
               <w:rPr>
                 <w:webHidden/>
@@ -983,7 +983,7 @@
             </w:tabs>
             <w:rPr/>
           </w:pPr>
-          <w:hyperlink w:anchor="__RefHeading___Toc2658_2520221899">
+          <w:hyperlink w:anchor="__RefHeading___Toc2658_875856940">
             <w:r>
               <w:rPr>
                 <w:webHidden/>
@@ -1004,7 +1004,7 @@
             </w:tabs>
             <w:rPr/>
           </w:pPr>
-          <w:hyperlink w:anchor="__RefHeading___Toc2660_2520221899">
+          <w:hyperlink w:anchor="__RefHeading___Toc2660_875856940">
             <w:r>
               <w:rPr>
                 <w:webHidden/>
@@ -1025,7 +1025,7 @@
             </w:tabs>
             <w:rPr/>
           </w:pPr>
-          <w:hyperlink w:anchor="__RefHeading___Toc2662_2520221899">
+          <w:hyperlink w:anchor="__RefHeading___Toc2662_875856940">
             <w:r>
               <w:rPr>
                 <w:webHidden/>
@@ -1046,7 +1046,7 @@
             </w:tabs>
             <w:rPr/>
           </w:pPr>
-          <w:hyperlink w:anchor="__RefHeading___Toc2664_2520221899">
+          <w:hyperlink w:anchor="__RefHeading___Toc2664_875856940">
             <w:r>
               <w:rPr>
                 <w:webHidden/>
@@ -1067,7 +1067,7 @@
             </w:tabs>
             <w:rPr/>
           </w:pPr>
-          <w:hyperlink w:anchor="__RefHeading___Toc2666_2520221899">
+          <w:hyperlink w:anchor="__RefHeading___Toc2666_875856940">
             <w:r>
               <w:rPr>
                 <w:webHidden/>
@@ -1088,7 +1088,7 @@
             </w:tabs>
             <w:rPr/>
           </w:pPr>
-          <w:hyperlink w:anchor="__RefHeading___Toc2668_2520221899">
+          <w:hyperlink w:anchor="__RefHeading___Toc2668_875856940">
             <w:r>
               <w:rPr>
                 <w:webHidden/>
@@ -1109,7 +1109,7 @@
             </w:tabs>
             <w:rPr/>
           </w:pPr>
-          <w:hyperlink w:anchor="__RefHeading___Toc2670_2520221899">
+          <w:hyperlink w:anchor="__RefHeading___Toc2670_875856940">
             <w:r>
               <w:rPr>
                 <w:webHidden/>
@@ -1130,7 +1130,7 @@
             </w:tabs>
             <w:rPr/>
           </w:pPr>
-          <w:hyperlink w:anchor="__RefHeading___Toc2672_2520221899">
+          <w:hyperlink w:anchor="__RefHeading___Toc2672_875856940">
             <w:r>
               <w:rPr>
                 <w:webHidden/>
@@ -1151,7 +1151,7 @@
             </w:tabs>
             <w:rPr/>
           </w:pPr>
-          <w:hyperlink w:anchor="__RefHeading___Toc2674_2520221899">
+          <w:hyperlink w:anchor="__RefHeading___Toc2674_875856940">
             <w:r>
               <w:rPr>
                 <w:webHidden/>
@@ -1172,7 +1172,7 @@
             </w:tabs>
             <w:rPr/>
           </w:pPr>
-          <w:hyperlink w:anchor="__RefHeading___Toc2676_2520221899">
+          <w:hyperlink w:anchor="__RefHeading___Toc2676_875856940">
             <w:r>
               <w:rPr>
                 <w:webHidden/>
@@ -1193,7 +1193,7 @@
             </w:tabs>
             <w:rPr/>
           </w:pPr>
-          <w:hyperlink w:anchor="__RefHeading___Toc2678_2520221899">
+          <w:hyperlink w:anchor="__RefHeading___Toc2678_875856940">
             <w:r>
               <w:rPr>
                 <w:webHidden/>
@@ -1316,7 +1316,7 @@
         <w:spacing w:before="0" w:after="120"/>
         <w:rPr/>
       </w:pPr>
-      <w:bookmarkStart w:id="2" w:name="__RefHeading___Toc2576_2520221899"/>
+      <w:bookmarkStart w:id="2" w:name="__RefHeading___Toc2576_875856940"/>
       <w:bookmarkEnd w:id="2"/>
       <w:r>
         <w:rPr>
@@ -1454,7 +1454,7 @@
         <w:spacing w:before="360" w:after="120"/>
         <w:rPr/>
       </w:pPr>
-      <w:bookmarkStart w:id="4" w:name="__RefHeading___Toc2578_2520221899"/>
+      <w:bookmarkStart w:id="4" w:name="__RefHeading___Toc2578_875856940"/>
       <w:bookmarkStart w:id="5" w:name="X616197512f394804f2fbf1774110e6f38740946"/>
       <w:bookmarkEnd w:id="4"/>
       <w:r>
@@ -1655,7 +1655,7 @@
         <w:spacing w:before="280" w:after="80"/>
         <w:rPr/>
       </w:pPr>
-      <w:bookmarkStart w:id="6" w:name="__RefHeading___Toc2580_2520221899"/>
+      <w:bookmarkStart w:id="6" w:name="__RefHeading___Toc2580_875856940"/>
       <w:bookmarkStart w:id="7" w:name="document-organization"/>
       <w:bookmarkEnd w:id="6"/>
       <w:r>
@@ -1703,7 +1703,7 @@
         <w:spacing w:before="200" w:after="80"/>
         <w:rPr/>
       </w:pPr>
-      <w:bookmarkStart w:id="8" w:name="__RefHeading___Toc2582_2520221899"/>
+      <w:bookmarkStart w:id="8" w:name="__RefHeading___Toc2582_875856940"/>
       <w:bookmarkStart w:id="9" w:name="front-matter"/>
       <w:bookmarkEnd w:id="8"/>
       <w:r>
@@ -1751,7 +1751,7 @@
         <w:spacing w:before="200" w:after="80"/>
         <w:rPr/>
       </w:pPr>
-      <w:bookmarkStart w:id="11" w:name="__RefHeading___Toc2584_2520221899"/>
+      <w:bookmarkStart w:id="11" w:name="__RefHeading___Toc2584_875856940"/>
       <w:bookmarkStart w:id="12" w:name="chapter-1-the-family-package"/>
       <w:bookmarkEnd w:id="11"/>
       <w:r>
@@ -1807,7 +1807,7 @@
         <w:spacing w:before="200" w:after="80"/>
         <w:rPr/>
       </w:pPr>
-      <w:bookmarkStart w:id="13" w:name="__RefHeading___Toc2586_2520221899"/>
+      <w:bookmarkStart w:id="13" w:name="__RefHeading___Toc2586_875856940"/>
       <w:bookmarkStart w:id="14" w:name="Xe73b40f1192db0acd779fe60e75b80c1263b700"/>
       <w:bookmarkEnd w:id="13"/>
       <w:r>
@@ -1880,7 +1880,7 @@
         <w:spacing w:before="200" w:after="80"/>
         <w:rPr/>
       </w:pPr>
-      <w:bookmarkStart w:id="15" w:name="__RefHeading___Toc2588_2520221899"/>
+      <w:bookmarkStart w:id="15" w:name="__RefHeading___Toc2588_875856940"/>
       <w:bookmarkStart w:id="16" w:name="Xfd03914965c1a36c753d69373597a3edba6d3ba"/>
       <w:bookmarkEnd w:id="15"/>
       <w:r>
@@ -1953,7 +1953,7 @@
         <w:spacing w:before="200" w:after="80"/>
         <w:rPr/>
       </w:pPr>
-      <w:bookmarkStart w:id="17" w:name="__RefHeading___Toc2590_2520221899"/>
+      <w:bookmarkStart w:id="17" w:name="__RefHeading___Toc2590_875856940"/>
       <w:bookmarkStart w:id="18" w:name="Xae2fb05cfd41b92d952510e81a7f289f9208afe"/>
       <w:bookmarkEnd w:id="17"/>
       <w:r>
@@ -2026,7 +2026,7 @@
         <w:spacing w:before="200" w:after="80"/>
         <w:rPr/>
       </w:pPr>
-      <w:bookmarkStart w:id="19" w:name="__RefHeading___Toc2592_2520221899"/>
+      <w:bookmarkStart w:id="19" w:name="__RefHeading___Toc2592_875856940"/>
       <w:bookmarkStart w:id="20" w:name="chapter-5-mc_training_layer"/>
       <w:bookmarkEnd w:id="19"/>
       <w:r>
@@ -2091,7 +2091,7 @@
         <w:spacing w:before="200" w:after="80"/>
         <w:rPr/>
       </w:pPr>
-      <w:bookmarkStart w:id="21" w:name="__RefHeading___Toc2594_2520221899"/>
+      <w:bookmarkStart w:id="21" w:name="__RefHeading___Toc2594_875856940"/>
       <w:bookmarkStart w:id="22" w:name="chapter-6-mc_ras_layer"/>
       <w:bookmarkEnd w:id="21"/>
       <w:r>
@@ -2156,7 +2156,7 @@
         <w:spacing w:before="200" w:after="80"/>
         <w:rPr/>
       </w:pPr>
-      <w:bookmarkStart w:id="23" w:name="__RefHeading___Toc2596_2520221899"/>
+      <w:bookmarkStart w:id="23" w:name="__RefHeading___Toc2596_875856940"/>
       <w:bookmarkStart w:id="24" w:name="X6b7ef090e93368a3c74775085b7d22e8fdb9bc1"/>
       <w:bookmarkEnd w:id="23"/>
       <w:r>
@@ -2229,7 +2229,7 @@
         <w:spacing w:before="200" w:after="80"/>
         <w:rPr/>
       </w:pPr>
-      <w:bookmarkStart w:id="25" w:name="__RefHeading___Toc2598_2520221899"/>
+      <w:bookmarkStart w:id="25" w:name="__RefHeading___Toc2598_875856940"/>
       <w:bookmarkStart w:id="26" w:name="chapter-8-mc_dfi_3p1_layer"/>
       <w:bookmarkEnd w:id="25"/>
       <w:r>
@@ -2294,7 +2294,7 @@
         <w:spacing w:before="200" w:after="80"/>
         <w:rPr/>
       </w:pPr>
-      <w:bookmarkStart w:id="27" w:name="__RefHeading___Toc2600_2520221899"/>
+      <w:bookmarkStart w:id="27" w:name="__RefHeading___Toc2600_875856940"/>
       <w:bookmarkStart w:id="28" w:name="chapter-9-mc_dfi_4p0_layer"/>
       <w:bookmarkEnd w:id="27"/>
       <w:r>
@@ -2453,7 +2453,7 @@
         <w:spacing w:before="360" w:after="120"/>
         <w:rPr/>
       </w:pPr>
-      <w:bookmarkStart w:id="32" w:name="__RefHeading___Toc2602_2520221899"/>
+      <w:bookmarkStart w:id="32" w:name="__RefHeading___Toc2602_875856940"/>
       <w:bookmarkStart w:id="33" w:name="document-information"/>
       <w:bookmarkEnd w:id="32"/>
       <w:r>
@@ -3036,7 +3036,7 @@
         <w:spacing w:before="280" w:after="80"/>
         <w:rPr/>
       </w:pPr>
-      <w:bookmarkStart w:id="34" w:name="__RefHeading___Toc2604_2520221899"/>
+      <w:bookmarkStart w:id="34" w:name="__RefHeading___Toc2604_875856940"/>
       <w:bookmarkEnd w:id="34"/>
       <w:r>
         <w:rPr>
@@ -3319,7 +3319,7 @@
         <w:spacing w:before="280" w:after="80"/>
         <w:rPr/>
       </w:pPr>
-      <w:bookmarkStart w:id="35" w:name="__RefHeading___Toc2606_2520221899"/>
+      <w:bookmarkStart w:id="35" w:name="__RefHeading___Toc2606_875856940"/>
       <w:bookmarkEnd w:id="35"/>
       <w:r>
         <w:rPr>
@@ -3871,7 +3871,7 @@
         <w:spacing w:before="360" w:after="120"/>
         <w:rPr/>
       </w:pPr>
-      <w:bookmarkStart w:id="37" w:name="__RefHeading___Toc2608_2520221899"/>
+      <w:bookmarkStart w:id="37" w:name="__RefHeading___Toc2608_875856940"/>
       <w:bookmarkStart w:id="38" w:name="purpose-scope-and-the-two-lines"/>
       <w:bookmarkEnd w:id="37"/>
       <w:r>
@@ -3902,7 +3902,7 @@
         <w:spacing w:before="280" w:after="80"/>
         <w:rPr/>
       </w:pPr>
-      <w:bookmarkStart w:id="39" w:name="__RefHeading___Toc2610_2520221899"/>
+      <w:bookmarkStart w:id="39" w:name="__RefHeading___Toc2610_875856940"/>
       <w:bookmarkStart w:id="40" w:name="purpose"/>
       <w:bookmarkEnd w:id="39"/>
       <w:r>
@@ -4056,7 +4056,7 @@
         <w:spacing w:before="280" w:after="80"/>
         <w:rPr/>
       </w:pPr>
-      <w:bookmarkStart w:id="41" w:name="__RefHeading___Toc2612_2520221899"/>
+      <w:bookmarkStart w:id="41" w:name="__RefHeading___Toc2612_875856940"/>
       <w:bookmarkStart w:id="42" w:name="X02b33bbc1801cd189339d45a688fcaae9520a66"/>
       <w:bookmarkEnd w:id="41"/>
       <w:r>
@@ -4139,7 +4139,7 @@
         <w:spacing w:before="280" w:after="80"/>
         <w:rPr/>
       </w:pPr>
-      <w:bookmarkStart w:id="43" w:name="__RefHeading___Toc2614_2520221899"/>
+      <w:bookmarkStart w:id="43" w:name="__RefHeading___Toc2614_875856940"/>
       <w:bookmarkStart w:id="44" w:name="the-two-lines-research-and-product"/>
       <w:bookmarkEnd w:id="43"/>
       <w:r>
@@ -4251,7 +4251,7 @@
         <w:spacing w:before="280" w:after="80"/>
         <w:rPr/>
       </w:pPr>
-      <w:bookmarkStart w:id="45" w:name="__RefHeading___Toc2616_2520221899"/>
+      <w:bookmarkStart w:id="45" w:name="__RefHeading___Toc2616_875856940"/>
       <w:bookmarkStart w:id="46" w:name="what-this-book-binds"/>
       <w:bookmarkEnd w:id="45"/>
       <w:r>
@@ -4396,7 +4396,7 @@
         <w:spacing w:before="280" w:after="80"/>
         <w:rPr/>
       </w:pPr>
-      <w:bookmarkStart w:id="48" w:name="__RefHeading___Toc2618_2520221899"/>
+      <w:bookmarkStart w:id="48" w:name="__RefHeading___Toc2618_875856940"/>
       <w:bookmarkStart w:id="49" w:name="conventions"/>
       <w:bookmarkEnd w:id="48"/>
       <w:r>
@@ -4529,7 +4529,7 @@
         <w:spacing w:before="360" w:after="120"/>
         <w:rPr/>
       </w:pPr>
-      <w:bookmarkStart w:id="52" w:name="__RefHeading___Toc2620_2520221899"/>
+      <w:bookmarkStart w:id="52" w:name="__RefHeading___Toc2620_875856940"/>
       <w:bookmarkStart w:id="53" w:name="X35fb09d53ce58ee1df67816bcaac5b674efa180"/>
       <w:bookmarkEnd w:id="52"/>
       <w:r>
@@ -4586,7 +4586,7 @@
         <w:rPr/>
         <w:drawing>
           <wp:inline distT="0" distB="0" distL="0" distR="0">
-            <wp:extent cx="5334000" cy="2749550"/>
+            <wp:extent cx="5334000" cy="3018790"/>
             <wp:effectExtent l="0" t="0" r="0" b="0"/>
             <wp:docPr id="11" name="Picture" descr="The mem-ctrl-ip whole unit — AXI channels at top, the layer stack in the middle, DDR PHY bar at the bottom"/>
             <wp:cNvGraphicFramePr>
@@ -4610,7 +4610,7 @@
                   <pic:spPr bwMode="auto">
                     <a:xfrm>
                       <a:off x="0" y="0"/>
-                      <a:ext cx="5334000" cy="2749550"/>
+                      <a:ext cx="5334000" cy="3018790"/>
                     </a:xfrm>
                     <a:prstGeom prst="rect">
                       <a:avLst/>
@@ -4642,7 +4642,7 @@
         <w:spacing w:before="280" w:after="80"/>
         <w:rPr/>
       </w:pPr>
-      <w:bookmarkStart w:id="54" w:name="__RefHeading___Toc2622_2520221899"/>
+      <w:bookmarkStart w:id="54" w:name="__RefHeading___Toc2622_875856940"/>
       <w:bookmarkEnd w:id="54"/>
       <w:r>
         <w:rPr>
@@ -5737,7 +5737,7 @@
         <w:spacing w:before="280" w:after="80"/>
         <w:rPr/>
       </w:pPr>
-      <w:bookmarkStart w:id="56" w:name="__RefHeading___Toc2624_2520221899"/>
+      <w:bookmarkStart w:id="56" w:name="__RefHeading___Toc2624_875856940"/>
       <w:bookmarkEnd w:id="56"/>
       <w:r>
         <w:rPr>
@@ -5833,7 +5833,7 @@
         <w:spacing w:before="280" w:after="80"/>
         <w:rPr/>
       </w:pPr>
-      <w:bookmarkStart w:id="57" w:name="__RefHeading___Toc2626_2520221899"/>
+      <w:bookmarkStart w:id="57" w:name="__RefHeading___Toc2626_875856940"/>
       <w:bookmarkStart w:id="58" w:name="the-three-structural-rules-of-the-stack"/>
       <w:bookmarkEnd w:id="57"/>
       <w:r>
@@ -5939,7 +5939,7 @@
         <w:spacing w:before="280" w:after="80"/>
         <w:rPr/>
       </w:pPr>
-      <w:bookmarkStart w:id="59" w:name="__RefHeading___Toc2628_2520221899"/>
+      <w:bookmarkStart w:id="59" w:name="__RefHeading___Toc2628_875856940"/>
       <w:bookmarkStart w:id="60" w:name="what-the-rocks-own"/>
       <w:bookmarkEnd w:id="59"/>
       <w:r>
@@ -6086,7 +6086,7 @@
         <w:spacing w:before="360" w:after="120"/>
         <w:rPr/>
       </w:pPr>
-      <w:bookmarkStart w:id="63" w:name="__RefHeading___Toc2630_2520221899"/>
+      <w:bookmarkStart w:id="63" w:name="__RefHeading___Toc2630_875856940"/>
       <w:bookmarkStart w:id="64" w:name="the-descriptor-seam"/>
       <w:bookmarkEnd w:id="63"/>
       <w:r>
@@ -6143,7 +6143,7 @@
         <w:spacing w:before="280" w:after="80"/>
         <w:rPr/>
       </w:pPr>
-      <w:bookmarkStart w:id="65" w:name="__RefHeading___Toc2632_2520221899"/>
+      <w:bookmarkStart w:id="65" w:name="__RefHeading___Toc2632_875856940"/>
       <w:bookmarkStart w:id="66" w:name="the-contract"/>
       <w:bookmarkEnd w:id="65"/>
       <w:r>
@@ -6283,7 +6283,7 @@
         <w:spacing w:before="280" w:after="80"/>
         <w:rPr/>
       </w:pPr>
-      <w:bookmarkStart w:id="68" w:name="__RefHeading___Toc2634_2520221899"/>
+      <w:bookmarkStart w:id="68" w:name="__RefHeading___Toc2634_875856940"/>
       <w:bookmarkStart w:id="69" w:name="the-invariants"/>
       <w:bookmarkEnd w:id="68"/>
       <w:r>
@@ -6390,7 +6390,7 @@
         <w:spacing w:before="280" w:after="80"/>
         <w:rPr/>
       </w:pPr>
-      <w:bookmarkStart w:id="70" w:name="__RefHeading___Toc2636_2520221899"/>
+      <w:bookmarkStart w:id="70" w:name="__RefHeading___Toc2636_875856940"/>
       <w:bookmarkStart w:id="71" w:name="what-the-seam-is-not"/>
       <w:bookmarkEnd w:id="70"/>
       <w:r>
@@ -6517,7 +6517,7 @@
         <w:spacing w:before="280" w:after="80"/>
         <w:rPr/>
       </w:pPr>
-      <w:bookmarkStart w:id="72" w:name="__RefHeading___Toc2638_2520221899"/>
+      <w:bookmarkStart w:id="72" w:name="__RefHeading___Toc2638_875856940"/>
       <w:bookmarkStart w:id="73" w:name="where-this-stands-in-the-rocks"/>
       <w:bookmarkEnd w:id="72"/>
       <w:r>
@@ -6663,7 +6663,7 @@
         <w:spacing w:before="360" w:after="120"/>
         <w:rPr/>
       </w:pPr>
-      <w:bookmarkStart w:id="76" w:name="__RefHeading___Toc2640_2520221899"/>
+      <w:bookmarkStart w:id="76" w:name="__RefHeading___Toc2640_875856940"/>
       <w:bookmarkStart w:id="77" w:name="Xba0e68e539aa7351d2f5c03a115f460d02e06c0"/>
       <w:bookmarkEnd w:id="76"/>
       <w:r>
@@ -6810,7 +6810,7 @@
         <w:spacing w:before="280" w:after="80"/>
         <w:rPr/>
       </w:pPr>
-      <w:bookmarkStart w:id="78" w:name="__RefHeading___Toc2642_2520221899"/>
+      <w:bookmarkStart w:id="78" w:name="__RefHeading___Toc2642_875856940"/>
       <w:bookmarkStart w:id="79" w:name="the-reasoning"/>
       <w:bookmarkEnd w:id="78"/>
       <w:r>
@@ -6919,7 +6919,7 @@
         <w:spacing w:before="280" w:after="80"/>
         <w:rPr/>
       </w:pPr>
-      <w:bookmarkStart w:id="80" w:name="__RefHeading___Toc2644_2520221899"/>
+      <w:bookmarkStart w:id="80" w:name="__RefHeading___Toc2644_875856940"/>
       <w:bookmarkStart w:id="81" w:name="what-is-shared"/>
       <w:bookmarkEnd w:id="80"/>
       <w:r>
@@ -7452,7 +7452,7 @@
         <w:spacing w:before="280" w:after="80"/>
         <w:rPr/>
       </w:pPr>
-      <w:bookmarkStart w:id="82" w:name="__RefHeading___Toc2646_2520221899"/>
+      <w:bookmarkStart w:id="82" w:name="__RefHeading___Toc2646_875856940"/>
       <w:bookmarkStart w:id="83" w:name="what-the-layer-never-does"/>
       <w:bookmarkEnd w:id="82"/>
       <w:r>
@@ -7613,7 +7613,7 @@
         <w:spacing w:before="360" w:after="120"/>
         <w:rPr/>
       </w:pPr>
-      <w:bookmarkStart w:id="86" w:name="__RefHeading___Toc2648_2520221899"/>
+      <w:bookmarkStart w:id="86" w:name="__RefHeading___Toc2648_875856940"/>
       <w:bookmarkStart w:id="87" w:name="Xc26196f7674c66983726de17c545c6649bb3fab"/>
       <w:bookmarkEnd w:id="86"/>
       <w:r>
@@ -7670,7 +7670,7 @@
         <w:spacing w:before="280" w:after="80"/>
         <w:rPr/>
       </w:pPr>
-      <w:bookmarkStart w:id="88" w:name="__RefHeading___Toc2650_2520221899"/>
+      <w:bookmarkStart w:id="88" w:name="__RefHeading___Toc2650_875856940"/>
       <w:bookmarkStart w:id="89" w:name="X8fa9d289b34687b6fa07df052b670cb17558661"/>
       <w:bookmarkEnd w:id="88"/>
       <w:r>
@@ -7747,7 +7747,7 @@
         <w:spacing w:before="280" w:after="80"/>
         <w:rPr/>
       </w:pPr>
-      <w:bookmarkStart w:id="90" w:name="__RefHeading___Toc2652_2520221899"/>
+      <w:bookmarkStart w:id="90" w:name="__RefHeading___Toc2652_875856940"/>
       <w:bookmarkStart w:id="91" w:name="parameterize-width-never-personality"/>
       <w:bookmarkEnd w:id="90"/>
       <w:r>
@@ -7851,7 +7851,7 @@
         <w:spacing w:before="280" w:after="80"/>
         <w:rPr/>
       </w:pPr>
-      <w:bookmarkStart w:id="92" w:name="__RefHeading___Toc2654_2520221899"/>
+      <w:bookmarkStart w:id="92" w:name="__RefHeading___Toc2654_875856940"/>
       <w:bookmarkStart w:id="93" w:name="X7c6b25d78360fe2e4fe81e68e87c32fcf8cda69"/>
       <w:bookmarkEnd w:id="92"/>
       <w:r>
@@ -7915,7 +7915,7 @@
         <w:spacing w:before="280" w:after="80"/>
         <w:rPr/>
       </w:pPr>
-      <w:bookmarkStart w:id="94" w:name="__RefHeading___Toc2656_2520221899"/>
+      <w:bookmarkStart w:id="94" w:name="__RefHeading___Toc2656_875856940"/>
       <w:bookmarkStart w:id="95" w:name="X416b554ca19ee0550a4692b0d160f4e163ab46b"/>
       <w:bookmarkEnd w:id="94"/>
       <w:r>
@@ -8019,7 +8019,7 @@
         <w:spacing w:before="280" w:after="80"/>
         <w:rPr/>
       </w:pPr>
-      <w:bookmarkStart w:id="96" w:name="__RefHeading___Toc2658_2520221899"/>
+      <w:bookmarkStart w:id="96" w:name="__RefHeading___Toc2658_875856940"/>
       <w:bookmarkStart w:id="97" w:name="X4e83b81ceef783af7b63185336af6225b7314d3"/>
       <w:bookmarkEnd w:id="96"/>
       <w:r>
@@ -8096,7 +8096,7 @@
         <w:spacing w:before="280" w:after="80"/>
         <w:rPr/>
       </w:pPr>
-      <w:bookmarkStart w:id="98" w:name="__RefHeading___Toc2660_2520221899"/>
+      <w:bookmarkStart w:id="98" w:name="__RefHeading___Toc2660_875856940"/>
       <w:bookmarkStart w:id="99" w:name="Xb3a20a7d499f0a0ca4e9f419fb6dadc4bc8a470"/>
       <w:bookmarkEnd w:id="98"/>
       <w:r>
@@ -8249,7 +8249,7 @@
         <w:spacing w:before="360" w:after="120"/>
         <w:rPr/>
       </w:pPr>
-      <w:bookmarkStart w:id="102" w:name="__RefHeading___Toc2662_2520221899"/>
+      <w:bookmarkStart w:id="102" w:name="__RefHeading___Toc2662_875856940"/>
       <w:bookmarkStart w:id="103" w:name="the-common-ip-layout"/>
       <w:bookmarkEnd w:id="102"/>
       <w:r>
@@ -8394,7 +8394,7 @@
         <w:spacing w:before="280" w:after="80"/>
         <w:rPr/>
       </w:pPr>
-      <w:bookmarkStart w:id="104" w:name="__RefHeading___Toc2664_2520221899"/>
+      <w:bookmarkStart w:id="104" w:name="__RefHeading___Toc2664_875856940"/>
       <w:bookmarkStart w:id="105" w:name="the-blocks-as-of-2026-10-10"/>
       <w:bookmarkEnd w:id="104"/>
       <w:r>
@@ -9670,7 +9670,7 @@
         <w:spacing w:before="280" w:after="80"/>
         <w:rPr/>
       </w:pPr>
-      <w:bookmarkStart w:id="106" w:name="__RefHeading___Toc2666_2520221899"/>
+      <w:bookmarkStart w:id="106" w:name="__RefHeading___Toc2666_875856940"/>
       <w:bookmarkStart w:id="107" w:name="X2611791d1bdfcecec1bf22dcc222e0c21c9b431"/>
       <w:bookmarkEnd w:id="106"/>
       <w:r>
@@ -9715,7 +9715,7 @@
         <w:spacing w:before="280" w:after="80"/>
         <w:rPr/>
       </w:pPr>
-      <w:bookmarkStart w:id="109" w:name="__RefHeading___Toc2668_2520221899"/>
+      <w:bookmarkStart w:id="109" w:name="__RefHeading___Toc2668_875856940"/>
       <w:bookmarkStart w:id="110" w:name="documentation-map"/>
       <w:bookmarkEnd w:id="109"/>
       <w:r>
@@ -10491,7 +10491,7 @@
         <w:spacing w:before="360" w:after="120"/>
         <w:rPr/>
       </w:pPr>
-      <w:bookmarkStart w:id="113" w:name="__RefHeading___Toc2670_2520221899"/>
+      <w:bookmarkStart w:id="113" w:name="__RefHeading___Toc2670_875856940"/>
       <w:bookmarkStart w:id="114" w:name="Xec01d7fcc00e62d53b5638288c846d5a89df379"/>
       <w:bookmarkEnd w:id="113"/>
       <w:r>
@@ -10534,7 +10534,7 @@
         <w:spacing w:before="280" w:after="80"/>
         <w:rPr/>
       </w:pPr>
-      <w:bookmarkStart w:id="115" w:name="__RefHeading___Toc2672_2520221899"/>
+      <w:bookmarkStart w:id="115" w:name="__RefHeading___Toc2672_875856940"/>
       <w:bookmarkStart w:id="116" w:name="the-product-names"/>
       <w:bookmarkEnd w:id="115"/>
       <w:r>
@@ -11137,7 +11137,7 @@
         <w:spacing w:before="280" w:after="80"/>
         <w:rPr/>
       </w:pPr>
-      <w:bookmarkStart w:id="118" w:name="__RefHeading___Toc2674_2520221899"/>
+      <w:bookmarkStart w:id="118" w:name="__RefHeading___Toc2674_875856940"/>
       <w:bookmarkStart w:id="119" w:name="Xa16f4717d14061f81a0dc9a449617a75cce903a"/>
       <w:bookmarkEnd w:id="118"/>
       <w:r>
@@ -11296,7 +11296,7 @@
         <w:spacing w:before="280" w:after="80"/>
         <w:rPr/>
       </w:pPr>
-      <w:bookmarkStart w:id="120" w:name="__RefHeading___Toc2676_2520221899"/>
+      <w:bookmarkStart w:id="120" w:name="__RefHeading___Toc2676_875856940"/>
       <w:bookmarkStart w:id="121" w:name="the-research-lines-role"/>
       <w:bookmarkEnd w:id="120"/>
       <w:r>
@@ -11341,7 +11341,7 @@
         <w:spacing w:before="280" w:after="80"/>
         <w:rPr/>
       </w:pPr>
-      <w:bookmarkStart w:id="123" w:name="__RefHeading___Toc2678_2520221899"/>
+      <w:bookmarkStart w:id="123" w:name="__RefHeading___Toc2678_875856940"/>
       <w:bookmarkStart w:id="124" w:name="relationship-to-the-rocks-books"/>
       <w:bookmarkEnd w:id="123"/>
       <w:r>

</xml_diff>